<commit_message>
Layout edit feature | Forms entry dynamic updation feature
</commit_message>
<xml_diff>
--- a/output/Master_Newsletter_ISSUE_2026_V1I1.docx
+++ b/output/Master_Newsletter_ISSUE_2026_V1I1.docx
@@ -4,2428 +4,1728 @@
   <w:body>
     <w:p>
       <w:pPr>
-        <w:spacing w:before="1440"/>
-        <w:jc w:val="center"/>
+        <w:spacing w:after="40"/>
       </w:pPr>
       <w:r>
         <w:rPr>
-          <w:rFonts w:ascii="Arial" w:hAnsi="Arial"/>
           <w:b/>
           <w:color w:val="1F4E78"/>
-          <w:sz w:val="72"/>
+          <w:sz w:val="60"/>
         </w:rPr>
         <w:t>IT CHRONICLES</w:t>
       </w:r>
     </w:p>
     <w:p>
       <w:pPr>
-        <w:jc w:val="center"/>
+        <w:spacing w:after="40"/>
       </w:pPr>
       <w:r>
         <w:rPr>
-          <w:rFonts w:ascii="Arial" w:hAnsi="Arial"/>
-          <w:i/>
-          <w:color w:val="595959"/>
-          <w:sz w:val="32"/>
+          <w:color w:val="475569"/>
+          <w:sz w:val="22"/>
         </w:rPr>
-        <w:t>Department of Information Technology Newsletter</w:t>
-      </w:r>
-    </w:p>
-    <w:p>
-      <w:pPr>
-        <w:spacing w:after="720"/>
-      </w:pPr>
-    </w:p>
-    <w:tbl>
-      <w:tblPr>
-        <w:tblW w:type="auto" w:w="0"/>
-        <w:jc w:val="center"/>
-        <w:tblLook w:firstColumn="1" w:firstRow="1" w:lastColumn="0" w:lastRow="0" w:noHBand="0" w:noVBand="1" w:val="04A0"/>
-      </w:tblPr>
-      <w:tblGrid>
-        <w:gridCol w:w="4968"/>
-        <w:gridCol w:w="4968"/>
-      </w:tblGrid>
-      <w:tr>
-        <w:tc>
-          <w:tcPr>
-            <w:tcW w:type="dxa" w:w="4968"/>
-          </w:tcPr>
-          <w:p>
-            <w:r>
-              <w:t>Volume &amp; Issue: Vol. 1 Issue 1</w:t>
-            </w:r>
-          </w:p>
-        </w:tc>
-        <w:tc>
-          <w:tcPr>
-            <w:tcW w:type="dxa" w:w="4968"/>
-          </w:tcPr>
-          <w:p>
-            <w:r>
-              <w:t>Academic Year: 2026-2027</w:t>
-            </w:r>
-          </w:p>
-        </w:tc>
-      </w:tr>
-      <w:tr>
-        <w:tc>
-          <w:tcPr>
-            <w:tcW w:type="dxa" w:w="4968"/>
-          </w:tcPr>
-          <w:p>
-            <w:r>
-              <w:t>Semester: Odd Semester (July - December 2026)</w:t>
-            </w:r>
-          </w:p>
-        </w:tc>
-        <w:tc>
-          <w:tcPr>
-            <w:tcW w:type="dxa" w:w="4968"/>
-          </w:tcPr>
-          <w:p>
-            <w:r>
-              <w:t>Publication Period: October 2026</w:t>
-            </w:r>
-          </w:p>
-        </w:tc>
-      </w:tr>
-    </w:tbl>
-    <w:p>
-      <w:r>
-        <w:br w:type="page"/>
-      </w:r>
-    </w:p>
-    <w:p>
-      <w:r>
-        <w:rPr>
-          <w:rFonts w:ascii="Arial" w:hAnsi="Arial"/>
-          <w:b/>
-          <w:color w:val="1F4E78"/>
-          <w:sz w:val="36"/>
-        </w:rPr>
-        <w:t>EDITORIAL &amp; MESSAGES</w:t>
-      </w:r>
-    </w:p>
-    <w:p>
-      <w:r>
-        <w:t>HOD Message: Welcome to the latest issue of IT Chronicles highlighting our department's milestones, research achievements, and student innovations.</w:t>
+        <w:t>Department of Information Technology · IT CHRONICLES</w:t>
       </w:r>
     </w:p>
     <w:p>
       <w:pPr>
         <w:spacing w:after="360"/>
       </w:pPr>
-    </w:p>
-    <w:p>
-      <w:r/>
+      <w:r>
+        <w:rPr>
+          <w:color w:val="64748B"/>
+          <w:sz w:val="19"/>
+        </w:rPr>
+        <w:t>Vol. 1 Issue 1 · 2026-2027 · Odd Semester (July - December 2026) · October 2026</w:t>
+      </w:r>
     </w:p>
     <w:p>
       <w:pPr>
-        <w:spacing w:before="400" w:after="160"/>
+        <w:pageBreakBefore w:val="0"/>
+        <w:tabs>
+          <w:tab w:pos="9029" w:val="right"/>
+        </w:tabs>
+        <w:spacing w:after="320"/>
+        <w:pBdr>
+          <w:top w:val="single" w:sz="36" w:space="6" w:color="1F4E78"/>
+          <w:bottom w:val="single" w:sz="12" w:space="4" w:color="1F4E78"/>
+        </w:pBdr>
       </w:pPr>
       <w:r>
         <w:rPr>
-          <w:rFonts w:ascii="Arial" w:hAnsi="Arial"/>
           <w:b/>
           <w:color w:val="1F4E78"/>
-          <w:sz w:val="36"/>
+          <w:sz w:val="17"/>
+          <w:spacing w:val="30"/>
         </w:rPr>
-        <w:t>RESEARCH &amp; INNOVATION</w:t>
+        <w:t>IT CHRONICLES · RESEARCH &amp; INNOVATION</w:t>
+      </w:r>
+      <w:r>
+        <w:rPr>
+          <w:b/>
+          <w:color w:val="64748B"/>
+          <w:sz w:val="17"/>
+        </w:rPr>
+        <w:tab/>
+        <w:t>VOL. 1 · ISSUE 1</w:t>
+      </w:r>
+    </w:p>
+    <w:p>
+      <w:pPr>
+        <w:spacing w:after="120"/>
+      </w:pPr>
+      <w:r>
+        <w:rPr>
+          <w:b/>
+          <w:i w:val="0"/>
+          <w:color w:val="FFFFFF"/>
+          <w:sz w:val="16"/>
+          <w:shd w:val="clear" w:color="auto" w:fill="C65911"/>
+        </w:rPr>
+        <w:t xml:space="preserve">  HTTPS://DOI.ORG/10.1109/TA.2026.001  </w:t>
+      </w:r>
+    </w:p>
+    <w:p>
+      <w:pPr>
+        <w:spacing w:after="100" w:line="288" w:lineRule="auto"/>
+        <w:jc w:val="left"/>
+      </w:pPr>
+      <w:r>
+        <w:rPr>
+          <w:b/>
+          <w:i w:val="0"/>
+          <w:color w:val="1F4E78"/>
+          <w:sz w:val="32"/>
+        </w:rPr>
+        <w:t>Advanced Quantum AI for Document Automation</w:t>
+      </w:r>
+    </w:p>
+    <w:p>
+      <w:pPr>
+        <w:spacing w:after="100"/>
+      </w:pPr>
+      <w:r>
+        <w:rPr>
+          <w:b/>
+          <w:i w:val="0"/>
+          <w:color w:val="0F2B48"/>
+          <w:sz w:val="24"/>
+        </w:rPr>
+        <w:t>By Dr. John Smith, Dr. Alice Johnson</w:t>
+      </w:r>
+    </w:p>
+    <w:p>
+      <w:pPr>
+        <w:spacing w:after="120"/>
+      </w:pPr>
+      <w:r>
+        <w:rPr>
+          <w:b w:val="0"/>
+          <w:i w:val="0"/>
+          <w:color w:val="64748B"/>
+          <w:sz w:val="20"/>
+        </w:rPr>
+        <w:t>IEEE Transactions on Automation · October 2026</w:t>
+      </w:r>
+    </w:p>
+    <w:p>
+      <w:pPr>
+        <w:spacing w:after="160" w:line="384" w:lineRule="auto"/>
+        <w:jc w:val="left"/>
+      </w:pPr>
+      <w:r>
+        <w:rPr>
+          <w:b w:val="0"/>
+          <w:i w:val="0"/>
+          <w:color w:val="334155"/>
+          <w:sz w:val="22"/>
+        </w:rPr>
+        <w:t>This paper presents a novel quantum architecture for normalizing dynamic newsletter components.</w:t>
+      </w:r>
+    </w:p>
+    <w:p>
+      <w:pPr>
+        <w:spacing w:after="160"/>
+      </w:pPr>
+      <w:hyperlink r:id="rId9">
+        <w:r>
+          <w:rPr>
+            <w:b/>
+            <w:color w:val="FFFFFF"/>
+            <w:sz w:val="19"/>
+            <w:shd w:val="clear" w:color="auto" w:fill="1F4E78"/>
+          </w:rPr>
+          <w:t xml:space="preserve">   🏆 View Certificate &amp; Project Demo   </w:t>
+        </w:r>
+      </w:hyperlink>
+    </w:p>
+    <w:p>
+      <w:pPr>
+        <w:spacing w:before="200" w:after="200"/>
+        <w:pBdr>
+          <w:bottom w:val="single" w:sz="6" w:space="1" w:color="D9DEE4"/>
+        </w:pBdr>
+      </w:pPr>
+    </w:p>
+    <w:p>
+      <w:pPr>
+        <w:spacing w:after="100" w:line="288" w:lineRule="auto"/>
+        <w:jc w:val="left"/>
+      </w:pPr>
+      <w:r>
+        <w:rPr>
+          <w:b/>
+          <w:i w:val="0"/>
+          <w:color w:val="1F4E78"/>
+          <w:sz w:val="32"/>
+        </w:rPr>
+        <w:t>Test - 1</w:t>
+      </w:r>
+    </w:p>
+    <w:p>
+      <w:pPr>
+        <w:spacing w:after="100"/>
+      </w:pPr>
+      <w:r>
+        <w:rPr>
+          <w:b/>
+          <w:i w:val="0"/>
+          <w:color w:val="0F2B48"/>
+          <w:sz w:val="24"/>
+        </w:rPr>
+        <w:t>By Mahadhevan, Mahadhevan</w:t>
+      </w:r>
+    </w:p>
+    <w:p>
+      <w:pPr>
+        <w:spacing w:after="120"/>
+      </w:pPr>
+      <w:r>
+        <w:rPr>
+          <w:b w:val="0"/>
+          <w:i w:val="0"/>
+          <w:color w:val="64748B"/>
+          <w:sz w:val="20"/>
+        </w:rPr>
+        <w:t>Q1 journal · February 2026</w:t>
+      </w:r>
+    </w:p>
+    <w:p>
+      <w:pPr>
+        <w:spacing w:after="160" w:line="384" w:lineRule="auto"/>
+        <w:jc w:val="left"/>
+      </w:pPr>
+      <w:r>
+        <w:rPr>
+          <w:b w:val="0"/>
+          <w:i w:val="0"/>
+          <w:color w:val="334155"/>
+          <w:sz w:val="22"/>
+        </w:rPr>
+        <w:t>Nothing</w:t>
+      </w:r>
+    </w:p>
+    <w:p>
+      <w:pPr>
+        <w:spacing w:before="200" w:after="200"/>
+        <w:pBdr>
+          <w:bottom w:val="single" w:sz="6" w:space="1" w:color="D9DEE4"/>
+        </w:pBdr>
+      </w:pPr>
+    </w:p>
+    <w:p>
+      <w:pPr>
+        <w:spacing w:after="120"/>
+      </w:pPr>
+      <w:r>
+        <w:rPr>
+          <w:b/>
+          <w:i w:val="0"/>
+          <w:color w:val="FFFFFF"/>
+          <w:sz w:val="16"/>
+          <w:shd w:val="clear" w:color="auto" w:fill="C65911"/>
+        </w:rPr>
+        <w:t xml:space="preserve">  HTTPS://DOI.ORG/10.1109/TNNLS.2026.109283  </w:t>
+      </w:r>
+    </w:p>
+    <w:p>
+      <w:pPr>
+        <w:spacing w:after="100" w:line="288" w:lineRule="auto"/>
+        <w:jc w:val="left"/>
+      </w:pPr>
+      <w:r>
+        <w:rPr>
+          <w:b/>
+          <w:i w:val="0"/>
+          <w:color w:val="1F4E78"/>
+          <w:sz w:val="32"/>
+        </w:rPr>
+        <w:t>Distributed Deep Learning Models for Natural Language Generation</w:t>
+      </w:r>
+    </w:p>
+    <w:p>
+      <w:pPr>
+        <w:spacing w:after="100"/>
+      </w:pPr>
+      <w:r>
+        <w:rPr>
+          <w:b/>
+          <w:i w:val="0"/>
+          <w:color w:val="0F2B48"/>
+          <w:sz w:val="24"/>
+        </w:rPr>
+        <w:t>By Dr. John Smith, Dr. Sarah Jenkins</w:t>
+      </w:r>
+    </w:p>
+    <w:p>
+      <w:pPr>
+        <w:spacing w:after="120"/>
+      </w:pPr>
+      <w:r>
+        <w:rPr>
+          <w:b w:val="0"/>
+          <w:i w:val="0"/>
+          <w:color w:val="64748B"/>
+          <w:sz w:val="20"/>
+        </w:rPr>
+        <w:t>IEEE Transactions on Neural Networks · September 2026</w:t>
+      </w:r>
+    </w:p>
+    <w:p>
+      <w:pPr>
+        <w:spacing w:after="160" w:line="384" w:lineRule="auto"/>
+        <w:jc w:val="left"/>
+      </w:pPr>
+      <w:r>
+        <w:rPr>
+          <w:b w:val="0"/>
+          <w:i w:val="0"/>
+          <w:color w:val="334155"/>
+          <w:sz w:val="22"/>
+        </w:rPr>
+        <w:t>Presents a novel gradient compression algorithm for multi-node deep learning clusters reducing inter-node communication latency by 45%.</w:t>
+      </w:r>
+    </w:p>
+    <w:p>
+      <w:pPr>
+        <w:spacing w:after="160"/>
+      </w:pPr>
+      <w:hyperlink r:id="rId10">
+        <w:r>
+          <w:rPr>
+            <w:b/>
+            <w:color w:val="FFFFFF"/>
+            <w:sz w:val="19"/>
+            <w:shd w:val="clear" w:color="auto" w:fill="1F4E78"/>
+          </w:rPr>
+          <w:t xml:space="preserve">   🏆 View Certificate &amp; Project Demo   </w:t>
+        </w:r>
+      </w:hyperlink>
+    </w:p>
+    <w:p>
+      <w:pPr>
+        <w:spacing w:before="200" w:after="200"/>
+        <w:pBdr>
+          <w:bottom w:val="single" w:sz="6" w:space="1" w:color="D9DEE4"/>
+        </w:pBdr>
+      </w:pPr>
+    </w:p>
+    <w:p>
+      <w:pPr>
+        <w:spacing w:after="120"/>
+      </w:pPr>
+      <w:r>
+        <w:rPr>
+          <w:b/>
+          <w:i w:val="0"/>
+          <w:color w:val="FFFFFF"/>
+          <w:sz w:val="16"/>
+          <w:shd w:val="clear" w:color="auto" w:fill="C65911"/>
+        </w:rPr>
+        <w:t xml:space="preserve">  GRANT AMOUNT: $75,000  </w:t>
+      </w:r>
+    </w:p>
+    <w:p>
+      <w:pPr>
+        <w:spacing w:after="100" w:line="288" w:lineRule="auto"/>
+        <w:jc w:val="left"/>
+      </w:pPr>
+      <w:r>
+        <w:rPr>
+          <w:b/>
+          <w:i w:val="0"/>
+          <w:color w:val="1F4E78"/>
+          <w:sz w:val="32"/>
+        </w:rPr>
+        <w:t>AI-Powered Smart Grid Monitoring &amp; Anomaly Detection System</w:t>
+      </w:r>
+    </w:p>
+    <w:p>
+      <w:pPr>
+        <w:spacing w:after="100"/>
+      </w:pPr>
+      <w:r>
+        <w:rPr>
+          <w:b/>
+          <w:i w:val="0"/>
+          <w:color w:val="0F2B48"/>
+          <w:sz w:val="24"/>
+        </w:rPr>
+        <w:t>By Dr. S. Kulkarni (PI), Prof. R. Varma (Co-PI)</w:t>
+      </w:r>
+    </w:p>
+    <w:p>
+      <w:pPr>
+        <w:spacing w:after="120"/>
+      </w:pPr>
+      <w:r>
+        <w:rPr>
+          <w:b w:val="0"/>
+          <w:i w:val="0"/>
+          <w:color w:val="64748B"/>
+          <w:sz w:val="20"/>
+        </w:rPr>
+        <w:t>Department of Science &amp; Technology (DST) · October 2026</w:t>
+      </w:r>
+    </w:p>
+    <w:p>
+      <w:pPr>
+        <w:spacing w:after="160" w:line="384" w:lineRule="auto"/>
+        <w:jc w:val="left"/>
+      </w:pPr>
+      <w:r>
+        <w:rPr>
+          <w:b w:val="0"/>
+          <w:i w:val="0"/>
+          <w:color w:val="334155"/>
+          <w:sz w:val="22"/>
+        </w:rPr>
+        <w:t>Sanctioned 3-year research project focused on deploying IoT sensors and edge computing models to detect electrical network grid faults in real time.</w:t>
+      </w:r>
+    </w:p>
+    <w:p>
+      <w:pPr>
+        <w:spacing w:after="160"/>
+      </w:pPr>
+      <w:hyperlink r:id="rId11">
+        <w:r>
+          <w:rPr>
+            <w:b/>
+            <w:color w:val="FFFFFF"/>
+            <w:sz w:val="19"/>
+            <w:shd w:val="clear" w:color="auto" w:fill="1F4E78"/>
+          </w:rPr>
+          <w:t xml:space="preserve">   🏆 View Certificate &amp; Project Demo   </w:t>
+        </w:r>
+      </w:hyperlink>
+    </w:p>
+    <w:p>
+      <w:pPr>
+        <w:pageBreakBefore/>
+        <w:tabs>
+          <w:tab w:pos="9029" w:val="right"/>
+        </w:tabs>
+        <w:spacing w:after="320"/>
+        <w:pBdr>
+          <w:top w:val="single" w:sz="36" w:space="6" w:color="1F4E78"/>
+          <w:bottom w:val="single" w:sz="12" w:space="4" w:color="1F4E78"/>
+        </w:pBdr>
+      </w:pPr>
+      <w:r>
+        <w:rPr>
+          <w:b/>
+          <w:color w:val="1F4E78"/>
+          <w:sz w:val="17"/>
+          <w:spacing w:val="30"/>
+        </w:rPr>
+        <w:t>IT CHRONICLES · FACULTY ACHIEVEMENTS</w:t>
+      </w:r>
+      <w:r>
+        <w:rPr>
+          <w:b/>
+          <w:color w:val="64748B"/>
+          <w:sz w:val="17"/>
+        </w:rPr>
+        <w:tab/>
+        <w:t>VOL. 1 · ISSUE 1</w:t>
+      </w:r>
+    </w:p>
+    <w:p>
+      <w:pPr>
+        <w:spacing w:after="120"/>
+      </w:pPr>
+      <w:r>
+        <w:rPr>
+          <w:b/>
+          <w:i w:val="0"/>
+          <w:color w:val="FFFFFF"/>
+          <w:sz w:val="16"/>
+          <w:shd w:val="clear" w:color="auto" w:fill="1F4E78"/>
+        </w:rPr>
+        <w:t xml:space="preserve">  NATIONAL ISTE AWARD  </w:t>
+      </w:r>
+    </w:p>
+    <w:p>
+      <w:pPr>
+        <w:spacing w:after="100" w:line="288" w:lineRule="auto"/>
+        <w:jc w:val="left"/>
+      </w:pPr>
+      <w:r>
+        <w:rPr>
+          <w:b/>
+          <w:i w:val="0"/>
+          <w:color w:val="1F4E78"/>
+          <w:sz w:val="32"/>
+        </w:rPr>
+        <w:t>Outstanding National Educator &amp; Pedagogy Excellence Award 2026</w:t>
+      </w:r>
+    </w:p>
+    <w:p>
+      <w:pPr>
+        <w:spacing w:after="100"/>
+      </w:pPr>
+      <w:r>
+        <w:rPr>
+          <w:b/>
+          <w:i w:val="0"/>
+          <w:color w:val="0F2B48"/>
+          <w:sz w:val="25"/>
+        </w:rPr>
+        <w:t>By Prof. Rajesh Varma</w:t>
+      </w:r>
+    </w:p>
+    <w:p>
+      <w:pPr>
+        <w:spacing w:after="120"/>
+      </w:pPr>
+      <w:r>
+        <w:rPr>
+          <w:b w:val="0"/>
+          <w:i w:val="0"/>
+          <w:color w:val="64748B"/>
+          <w:sz w:val="20"/>
+        </w:rPr>
+        <w:t>Indian Society for Technical Education (ISTE) · September 2026</w:t>
       </w:r>
     </w:p>
     <w:tbl>
       <w:tblPr>
         <w:tblW w:type="auto" w:w="0"/>
-        <w:jc w:val="center"/>
+        <w:jc w:val="left"/>
+        <w:tblLayout w:type="fixed"/>
         <w:tblLook w:firstColumn="1" w:firstRow="1" w:lastColumn="0" w:lastRow="0" w:noHBand="0" w:noVBand="1" w:val="04A0"/>
+        <w:tblLayout w:type="fixed"/>
       </w:tblPr>
       <w:tblGrid>
-        <w:gridCol w:w="3312"/>
-        <w:gridCol w:w="3312"/>
-        <w:gridCol w:w="3312"/>
+        <w:gridCol w:w="3516"/>
+        <w:gridCol w:w="5513"/>
       </w:tblGrid>
       <w:tr>
         <w:tc>
           <w:tcPr>
-            <w:tcW w:type="dxa" w:w="3312"/>
-            <w:shd w:fill="F2F4F7"/>
+            <w:tcW w:type="dxa" w:w="3516"/>
+            <w:tcMar>
+              <w:top w:w="0" w:type="dxa"/>
+              <w:left w:w="0" w:type="dxa"/>
+              <w:bottom w:w="0" w:type="dxa"/>
+              <w:right w:w="120" w:type="dxa"/>
+            </w:tcMar>
           </w:tcPr>
           <w:p>
+            <w:pPr>
+              <w:spacing w:after="0"/>
+            </w:pPr>
             <w:r>
-              <w:rPr>
-                <w:sz w:val="18"/>
-              </w:rPr>
-              <w:t>Total Submissions</w:t>
+              <w:drawing>
+                <wp:inline xmlns:a="http://schemas.openxmlformats.org/drawingml/2006/main" xmlns:pic="http://schemas.openxmlformats.org/drawingml/2006/picture">
+                  <wp:extent cx="2095499" cy="2095499"/>
+                  <wp:docPr id="1" name="Picture 1"/>
+                  <wp:cNvGraphicFramePr>
+                    <a:graphicFrameLocks noChangeAspect="1"/>
+                  </wp:cNvGraphicFramePr>
+                  <a:graphic>
+                    <a:graphicData uri="http://schemas.openxmlformats.org/drawingml/2006/picture">
+                      <pic:pic>
+                        <pic:nvPicPr>
+                          <pic:cNvPr id="0" name="crop_94aad662f375d5de8721396fe933ffa8.jpg"/>
+                          <pic:cNvPicPr/>
+                        </pic:nvPicPr>
+                        <pic:blipFill>
+                          <a:blip r:embed="rId12"/>
+                          <a:stretch>
+                            <a:fillRect/>
+                          </a:stretch>
+                        </pic:blipFill>
+                        <pic:spPr>
+                          <a:xfrm>
+                            <a:off x="0" y="0"/>
+                            <a:ext cx="2095499" cy="2095499"/>
+                          </a:xfrm>
+                          <a:prstGeom prst="rect"/>
+                        </pic:spPr>
+                      </pic:pic>
+                    </a:graphicData>
+                  </a:graphic>
+                </wp:inline>
+              </w:drawing>
             </w:r>
           </w:p>
           <w:p>
+            <w:pPr>
+              <w:spacing w:after="160"/>
+              <w:shd w:val="clear" w:color="auto" w:fill="F8FAFC"/>
+            </w:pPr>
             <w:r>
               <w:rPr>
-                <w:b/>
-                <w:color w:val="1F4E78"/>
-                <w:sz w:val="36"/>
+                <w:b w:val="0"/>
+                <w:i/>
+                <w:color w:val="64748B"/>
+                <w:sz w:val="18"/>
               </w:rPr>
-              <w:t>3</w:t>
+              <w:t xml:space="preserve"> Prof. Rajesh Varma receiving the National Educator Trophy from the Chairman of ISTE</w:t>
             </w:r>
           </w:p>
         </w:tc>
         <w:tc>
           <w:tcPr>
-            <w:tcW w:type="dxa" w:w="3312"/>
-            <w:shd w:fill="EBF3F9"/>
+            <w:tcW w:type="dxa" w:w="5513"/>
+            <w:tcMar>
+              <w:top w:w="0" w:type="dxa"/>
+              <w:left w:w="120" w:type="dxa"/>
+              <w:bottom w:w="0" w:type="dxa"/>
+              <w:right w:w="0" w:type="dxa"/>
+            </w:tcMar>
           </w:tcPr>
           <w:p>
+            <w:pPr>
+              <w:spacing w:after="160" w:line="384" w:lineRule="auto"/>
+              <w:jc w:val="left"/>
+            </w:pPr>
             <w:r>
               <w:rPr>
-                <w:sz w:val="18"/>
+                <w:b w:val="0"/>
+                <w:i w:val="0"/>
+                <w:color w:val="222222"/>
+                <w:sz w:val="22"/>
               </w:rPr>
-              <w:t>Active Categories</w:t>
+              <w:t>Conferred the prestigious National Educator Award during the 54th Annual ISTE Convention for ground-breaking curriculum design in Cloud Computing and undergraduate research mentorship.</w:t>
             </w:r>
           </w:p>
           <w:p>
-            <w:r>
-              <w:rPr>
-                <w:b/>
-                <w:color w:val="2E75B6"/>
-                <w:sz w:val="36"/>
-              </w:rPr>
-              <w:t>0</w:t>
-            </w:r>
-          </w:p>
-        </w:tc>
-        <w:tc>
-          <w:tcPr>
-            <w:tcW w:type="dxa" w:w="3312"/>
-            <w:shd w:fill="F2F4F7"/>
-          </w:tcPr>
-          <w:p>
-            <w:r>
-              <w:rPr>
-                <w:sz w:val="18"/>
-              </w:rPr>
-              <w:t>Section Status</w:t>
-            </w:r>
-          </w:p>
-          <w:p>
-            <w:r>
-              <w:rPr>
-                <w:b/>
-                <w:color w:val="548235"/>
-                <w:sz w:val="28"/>
-              </w:rPr>
-              <w:t>VERIFIED</w:t>
-            </w:r>
+            <w:pPr>
+              <w:spacing w:after="160"/>
+            </w:pPr>
+            <w:hyperlink r:id="rId13">
+              <w:r>
+                <w:rPr>
+                  <w:b/>
+                  <w:color w:val="1F4E78"/>
+                  <w:sz w:val="19"/>
+                  <w:bdr w:val="single" w:sz="12" w:space="2" w:color="1F4E78"/>
+                </w:rPr>
+                <w:t xml:space="preserve">   🎖️ View Official Citation   </w:t>
+              </w:r>
+            </w:hyperlink>
           </w:p>
         </w:tc>
       </w:tr>
     </w:tbl>
     <w:p>
       <w:pPr>
-        <w:spacing w:after="200"/>
+        <w:spacing w:before="200" w:after="200"/>
+        <w:pBdr>
+          <w:bottom w:val="single" w:sz="6" w:space="1" w:color="D9DEE4"/>
+        </w:pBdr>
       </w:pPr>
     </w:p>
     <w:p>
       <w:pPr>
-        <w:spacing w:before="240"/>
+        <w:spacing w:after="100" w:line="288" w:lineRule="auto"/>
+        <w:jc w:val="left"/>
       </w:pPr>
       <w:r>
         <w:rPr>
-          <w:rFonts w:ascii="Arial" w:hAnsi="Arial"/>
           <w:b/>
-          <w:color w:val="C65911"/>
-          <w:sz w:val="26"/>
+          <w:i w:val="0"/>
+          <w:color w:val="1F4E78"/>
+          <w:sz w:val="32"/>
         </w:rPr>
-        <w:t>★  SPOTLIGHT &amp; FEATURED HIGHLIGHTS</w:t>
+        <w:t>Outstanding Educator &amp; Researcher Award 2026</w:t>
       </w:r>
     </w:p>
-    <w:tbl>
-      <w:tblPr>
-        <w:tblW w:type="auto" w:w="0"/>
-        <w:jc w:val="center"/>
-        <w:tblLook w:firstColumn="1" w:firstRow="1" w:lastColumn="0" w:lastRow="0" w:noHBand="0" w:noVBand="1" w:val="04A0"/>
-      </w:tblPr>
-      <w:tblGrid>
-        <w:gridCol w:w="9936"/>
-      </w:tblGrid>
-      <w:tr>
-        <w:tc>
-          <w:tcPr>
-            <w:tcW w:type="dxa" w:w="9936"/>
-            <w:shd w:fill="FFF8F0"/>
-          </w:tcPr>
-          <w:p>
-            <w:r>
-              <w:rPr>
-                <w:rFonts w:ascii="Arial" w:hAnsi="Arial"/>
-                <w:b/>
-                <w:color w:val="C65911"/>
-                <w:sz w:val="24"/>
-              </w:rPr>
-              <w:t>Distributed Deep Learning Models for Natural Language Generation</w:t>
-            </w:r>
-          </w:p>
-          <w:p>
-            <w:r>
-              <w:rPr>
-                <w:sz w:val="19"/>
-              </w:rPr>
-              <w:t>By: Dr. John Smith, Dr. Sarah Jenkins  |  Date: September 2026</w:t>
-            </w:r>
-            <w:r>
-              <w:rPr>
-                <w:sz w:val="19"/>
-              </w:rPr>
-              <w:t xml:space="preserve">  |  Venue: IEEE Transactions on Neural Networks</w:t>
-            </w:r>
-          </w:p>
-          <w:p>
-            <w:r>
-              <w:rPr>
-                <w:sz w:val="20"/>
-              </w:rPr>
-              <w:t>Presents a novel gradient compression algorithm for multi-node deep learning clusters reducing inter-node communication latency by 45%.</w:t>
-            </w:r>
-          </w:p>
-          <w:p>
-            <w:r>
-              <w:rPr>
-                <w:i/>
-                <w:color w:val="1F4E78"/>
-                <w:sz w:val="18"/>
-              </w:rPr>
-              <w:t>Photo Attachment: https://drive.google.com/research_pub1.jpg</w:t>
-            </w:r>
-          </w:p>
-        </w:tc>
-      </w:tr>
-    </w:tbl>
+    <w:p>
+      <w:pPr>
+        <w:spacing w:after="100"/>
+      </w:pPr>
+      <w:r>
+        <w:rPr>
+          <w:b/>
+          <w:i w:val="0"/>
+          <w:color w:val="0F2B48"/>
+          <w:sz w:val="25"/>
+        </w:rPr>
+        <w:t>By Prof. Rajesh Varma</w:t>
+      </w:r>
+    </w:p>
+    <w:p>
+      <w:pPr>
+        <w:spacing w:after="120"/>
+      </w:pPr>
+      <w:r>
+        <w:rPr>
+          <w:b w:val="0"/>
+          <w:i w:val="0"/>
+          <w:color w:val="64748B"/>
+          <w:sz w:val="20"/>
+        </w:rPr>
+        <w:t>Indian Society for Technical Education (ISTE) · September 2026</w:t>
+      </w:r>
+    </w:p>
+    <w:p>
+      <w:pPr>
+        <w:spacing w:after="160" w:line="384" w:lineRule="auto"/>
+        <w:jc w:val="left"/>
+      </w:pPr>
+      <w:r>
+        <w:rPr>
+          <w:b w:val="0"/>
+          <w:i w:val="0"/>
+          <w:color w:val="222222"/>
+          <w:sz w:val="22"/>
+        </w:rPr>
+        <w:t>Conferred the prestigious National Educator Award for excellence in computer science pedagogy and undergraduate research mentorship.</w:t>
+      </w:r>
+    </w:p>
+    <w:p>
+      <w:pPr>
+        <w:spacing w:before="200" w:after="200"/>
+        <w:pBdr>
+          <w:bottom w:val="single" w:sz="6" w:space="1" w:color="D9DEE4"/>
+        </w:pBdr>
+      </w:pPr>
+    </w:p>
+    <w:p>
+      <w:pPr>
+        <w:spacing w:after="100" w:line="288" w:lineRule="auto"/>
+        <w:jc w:val="left"/>
+      </w:pPr>
+      <w:r>
+        <w:rPr>
+          <w:b/>
+          <w:i w:val="0"/>
+          <w:color w:val="1F4E78"/>
+          <w:sz w:val="32"/>
+        </w:rPr>
+        <w:t>Best Researcher Award 2026</w:t>
+      </w:r>
+    </w:p>
+    <w:p>
+      <w:pPr>
+        <w:spacing w:after="100"/>
+      </w:pPr>
+      <w:r>
+        <w:rPr>
+          <w:b/>
+          <w:i w:val="0"/>
+          <w:color w:val="0F2B48"/>
+          <w:sz w:val="25"/>
+        </w:rPr>
+        <w:t>By Prof. Rajesh Varma</w:t>
+      </w:r>
+    </w:p>
+    <w:p>
+      <w:pPr>
+        <w:spacing w:after="120"/>
+      </w:pPr>
+      <w:r>
+        <w:rPr>
+          <w:b w:val="0"/>
+          <w:i w:val="0"/>
+          <w:color w:val="64748B"/>
+          <w:sz w:val="20"/>
+        </w:rPr>
+        <w:t>International Science Foundation · September 2026</w:t>
+      </w:r>
+    </w:p>
+    <w:p>
+      <w:pPr>
+        <w:spacing w:after="160" w:line="384" w:lineRule="auto"/>
+        <w:jc w:val="left"/>
+      </w:pPr>
+      <w:r>
+        <w:rPr>
+          <w:b w:val="0"/>
+          <w:i w:val="0"/>
+          <w:color w:val="222222"/>
+          <w:sz w:val="22"/>
+        </w:rPr>
+        <w:t>Awarded for exceptional contributions to distributed cloud computing architectures.</w:t>
+      </w:r>
+    </w:p>
+    <w:p>
+      <w:pPr>
+        <w:spacing w:before="200" w:after="200"/>
+        <w:pBdr>
+          <w:bottom w:val="single" w:sz="6" w:space="1" w:color="D9DEE4"/>
+        </w:pBdr>
+      </w:pPr>
+    </w:p>
+    <w:p>
+      <w:pPr>
+        <w:spacing w:after="120"/>
+      </w:pPr>
+      <w:r>
+        <w:rPr>
+          <w:b/>
+          <w:i w:val="0"/>
+          <w:color w:val="FFFFFF"/>
+          <w:sz w:val="16"/>
+          <w:shd w:val="clear" w:color="auto" w:fill="1F4E78"/>
+        </w:rPr>
+        <w:t xml:space="preserve">  KEYNOTE SPEAKER  </w:t>
+      </w:r>
+    </w:p>
+    <w:p>
+      <w:pPr>
+        <w:spacing w:after="100" w:line="288" w:lineRule="auto"/>
+        <w:jc w:val="left"/>
+      </w:pPr>
+      <w:r>
+        <w:rPr>
+          <w:b/>
+          <w:i w:val="0"/>
+          <w:color w:val="1F4E78"/>
+          <w:sz w:val="32"/>
+        </w:rPr>
+        <w:t>Keynote Lecture on Cybersecurity &amp; Zero Trust Frameworks</w:t>
+      </w:r>
+    </w:p>
+    <w:p>
+      <w:pPr>
+        <w:spacing w:after="100"/>
+      </w:pPr>
+      <w:r>
+        <w:rPr>
+          <w:b/>
+          <w:i w:val="0"/>
+          <w:color w:val="0F2B48"/>
+          <w:sz w:val="25"/>
+        </w:rPr>
+        <w:t>By Ms. P. Nair</w:t>
+      </w:r>
+    </w:p>
+    <w:p>
+      <w:pPr>
+        <w:spacing w:after="120"/>
+      </w:pPr>
+      <w:r>
+        <w:rPr>
+          <w:b w:val="0"/>
+          <w:i w:val="0"/>
+          <w:color w:val="64748B"/>
+          <w:sz w:val="20"/>
+        </w:rPr>
+        <w:t>International Cyber Defense Summit 2026 · October 2026</w:t>
+      </w:r>
+    </w:p>
+    <w:p>
+      <w:pPr>
+        <w:spacing w:after="160" w:line="384" w:lineRule="auto"/>
+        <w:jc w:val="left"/>
+      </w:pPr>
+      <w:r>
+        <w:rPr>
+          <w:b w:val="0"/>
+          <w:i w:val="0"/>
+          <w:color w:val="222222"/>
+          <w:sz w:val="22"/>
+        </w:rPr>
+        <w:t>Delivered an invited expert keynote address on enterprise Zero Trust Architecture to over 500 cybersecurity practitioners and C-suite executives.</w:t>
+      </w:r>
+    </w:p>
     <w:p>
       <w:pPr>
         <w:spacing w:after="160"/>
       </w:pPr>
+      <w:hyperlink r:id="rId14">
+        <w:r>
+          <w:rPr>
+            <w:b/>
+            <w:color w:val="1F4E78"/>
+            <w:sz w:val="19"/>
+            <w:bdr w:val="single" w:sz="12" w:space="2" w:color="1F4E78"/>
+          </w:rPr>
+          <w:t xml:space="preserve">   🎖️ View Official Citation   </w:t>
+        </w:r>
+      </w:hyperlink>
     </w:p>
     <w:p>
       <w:pPr>
-        <w:spacing w:before="240" w:after="80"/>
-      </w:pPr>
-      <w:r>
-        <w:rPr>
-          <w:rFonts w:ascii="Arial" w:hAnsi="Arial"/>
-          <w:b/>
-          <w:color w:val="1F4E78"/>
-          <w:sz w:val="26"/>
-        </w:rPr>
-        <w:t>■  Journal Publications</w:t>
-      </w:r>
-    </w:p>
-    <w:tbl>
-      <w:tblPr>
-        <w:tblW w:type="auto" w:w="0"/>
-        <w:jc w:val="center"/>
-        <w:tblLook w:firstColumn="1" w:firstRow="1" w:lastColumn="0" w:lastRow="0" w:noHBand="0" w:noVBand="1" w:val="04A0"/>
-      </w:tblPr>
-      <w:tblGrid>
-        <w:gridCol w:w="2484"/>
-        <w:gridCol w:w="2484"/>
-        <w:gridCol w:w="2484"/>
-        <w:gridCol w:w="2484"/>
-      </w:tblGrid>
-      <w:tr>
-        <w:tc>
-          <w:tcPr>
-            <w:tcW w:type="dxa" w:w="1296"/>
-            <w:shd w:fill="1F4E78"/>
-          </w:tcPr>
-          <w:p>
-            <w:r>
-              <w:rPr>
-                <w:rFonts w:ascii="Arial" w:hAnsi="Arial"/>
-                <w:b/>
-                <w:color w:val="FFFFFF"/>
-                <w:sz w:val="19"/>
-              </w:rPr>
-              <w:t>Date</w:t>
-            </w:r>
-          </w:p>
-        </w:tc>
-        <w:tc>
-          <w:tcPr>
-            <w:tcW w:type="dxa" w:w="3168"/>
-            <w:shd w:fill="1F4E78"/>
-          </w:tcPr>
-          <w:p>
-            <w:r>
-              <w:rPr>
-                <w:rFonts w:ascii="Arial" w:hAnsi="Arial"/>
-                <w:b/>
-                <w:color w:val="FFFFFF"/>
-                <w:sz w:val="19"/>
-              </w:rPr>
-              <w:t>Title &amp; Contributor</w:t>
-            </w:r>
-          </w:p>
-        </w:tc>
-        <w:tc>
-          <w:tcPr>
-            <w:tcW w:type="dxa" w:w="2592"/>
-            <w:shd w:fill="1F4E78"/>
-          </w:tcPr>
-          <w:p>
-            <w:r>
-              <w:rPr>
-                <w:rFonts w:ascii="Arial" w:hAnsi="Arial"/>
-                <w:b/>
-                <w:color w:val="FFFFFF"/>
-                <w:sz w:val="19"/>
-              </w:rPr>
-              <w:t>Venue / Organization / Grant</w:t>
-            </w:r>
-          </w:p>
-        </w:tc>
-        <w:tc>
-          <w:tcPr>
-            <w:tcW w:type="dxa" w:w="3024"/>
-            <w:shd w:fill="1F4E78"/>
-          </w:tcPr>
-          <w:p>
-            <w:r>
-              <w:rPr>
-                <w:rFonts w:ascii="Arial" w:hAnsi="Arial"/>
-                <w:b/>
-                <w:color w:val="FFFFFF"/>
-                <w:sz w:val="19"/>
-              </w:rPr>
-              <w:t>Details &amp; Impact</w:t>
-            </w:r>
-          </w:p>
-        </w:tc>
-      </w:tr>
-      <w:tr>
-        <w:tc>
-          <w:tcPr>
-            <w:tcW w:type="dxa" w:w="2484"/>
-            <w:shd w:fill="FFFFFF"/>
-          </w:tcPr>
-          <w:p>
-            <w:r>
-              <w:rPr>
-                <w:sz w:val="18"/>
-              </w:rPr>
-              <w:t>September 2026</w:t>
-            </w:r>
-          </w:p>
-        </w:tc>
-        <w:tc>
-          <w:tcPr>
-            <w:tcW w:type="dxa" w:w="2484"/>
-            <w:shd w:fill="FFFFFF"/>
-          </w:tcPr>
-          <w:p>
-            <w:r>
-              <w:rPr>
-                <w:b/>
-                <w:sz w:val="19"/>
-              </w:rPr>
-              <w:t>Distributed Deep Learning Models for Natural Language Generation</w:t>
-            </w:r>
-          </w:p>
-          <w:p>
-            <w:r>
-              <w:rPr>
-                <w:sz w:val="17"/>
-              </w:rPr>
-              <w:t>By: Dr. John Smith, Dr. Sarah Jenkins</w:t>
-            </w:r>
-          </w:p>
-        </w:tc>
-        <w:tc>
-          <w:tcPr>
-            <w:tcW w:type="dxa" w:w="2484"/>
-            <w:shd w:fill="FFFFFF"/>
-          </w:tcPr>
-          <w:p>
-            <w:r>
-              <w:rPr>
-                <w:sz w:val="18"/>
-              </w:rPr>
-              <w:t>IEEE Transactions on Neural Networks</w:t>
-            </w:r>
-          </w:p>
-          <w:p>
-            <w:r>
-              <w:rPr>
-                <w:sz w:val="17"/>
-              </w:rPr>
-              <w:t>Value: https://doi.org/10.1109/TNNLS.2026.109283</w:t>
-            </w:r>
-          </w:p>
-          <w:p>
-            <w:r>
-              <w:rPr>
-                <w:sz w:val="17"/>
-              </w:rPr>
-              <w:t>Impact: Impact Factor 10.2 / Scopus Q1</w:t>
-            </w:r>
-          </w:p>
-        </w:tc>
-        <w:tc>
-          <w:tcPr>
-            <w:tcW w:type="dxa" w:w="2484"/>
-            <w:shd w:fill="FFFFFF"/>
-          </w:tcPr>
-          <w:p>
-            <w:r>
-              <w:rPr>
-                <w:sz w:val="18"/>
-              </w:rPr>
-              <w:t>Presents a novel gradient compression algorithm for multi-node deep learning clusters reducing inter-node communication latency by 45%.</w:t>
-            </w:r>
-          </w:p>
-          <w:p>
-            <w:r>
-              <w:rPr>
-                <w:sz w:val="17"/>
-              </w:rPr>
-              <w:t>Link: https://doi.org/10.1109/TNNLS.2026.109283</w:t>
-            </w:r>
-          </w:p>
-        </w:tc>
-      </w:tr>
-      <w:tr>
-        <w:tc>
-          <w:tcPr>
-            <w:tcW w:type="dxa" w:w="2484"/>
-            <w:shd w:fill="F9FAFB"/>
-          </w:tcPr>
-          <w:p>
-            <w:r>
-              <w:rPr>
-                <w:sz w:val="18"/>
-              </w:rPr>
-              <w:t>October 2026</w:t>
-            </w:r>
-          </w:p>
-        </w:tc>
-        <w:tc>
-          <w:tcPr>
-            <w:tcW w:type="dxa" w:w="2484"/>
-            <w:shd w:fill="F9FAFB"/>
-          </w:tcPr>
-          <w:p>
-            <w:r>
-              <w:rPr>
-                <w:b/>
-                <w:sz w:val="19"/>
-              </w:rPr>
-              <w:t>Advanced Quantum AI for Document Automation</w:t>
-            </w:r>
-          </w:p>
-          <w:p>
-            <w:r>
-              <w:rPr>
-                <w:sz w:val="17"/>
-              </w:rPr>
-              <w:t>By: Dr. John Smith, Dr. Alice Johnson</w:t>
-            </w:r>
-          </w:p>
-        </w:tc>
-        <w:tc>
-          <w:tcPr>
-            <w:tcW w:type="dxa" w:w="2484"/>
-            <w:shd w:fill="F9FAFB"/>
-          </w:tcPr>
-          <w:p>
-            <w:r>
-              <w:rPr>
-                <w:sz w:val="18"/>
-              </w:rPr>
-              <w:t>IEEE Transactions on Automation</w:t>
-            </w:r>
-          </w:p>
-          <w:p>
-            <w:r>
-              <w:rPr>
-                <w:sz w:val="17"/>
-              </w:rPr>
-              <w:t>Value: https://doi.org/10.1109/TA.2026.001</w:t>
-            </w:r>
-          </w:p>
-          <w:p>
-            <w:r>
-              <w:rPr>
-                <w:sz w:val="17"/>
-              </w:rPr>
-              <w:t>Impact: Impact Factor 8.5 / Scopus Q1</w:t>
-            </w:r>
-          </w:p>
-        </w:tc>
-        <w:tc>
-          <w:tcPr>
-            <w:tcW w:type="dxa" w:w="2484"/>
-            <w:shd w:fill="F9FAFB"/>
-          </w:tcPr>
-          <w:p>
-            <w:r>
-              <w:rPr>
-                <w:sz w:val="18"/>
-              </w:rPr>
-              <w:t>This paper presents a novel quantum architecture for normalizing dynamic newsletter components.</w:t>
-            </w:r>
-          </w:p>
-          <w:p>
-            <w:r>
-              <w:rPr>
-                <w:sz w:val="17"/>
-              </w:rPr>
-              <w:t>Link: https://drive.google.com/cert1.pdf</w:t>
-            </w:r>
-          </w:p>
-        </w:tc>
-      </w:tr>
-    </w:tbl>
-    <w:p>
-      <w:pPr>
-        <w:spacing w:after="240"/>
+        <w:spacing w:before="200" w:after="200"/>
+        <w:pBdr>
+          <w:bottom w:val="single" w:sz="6" w:space="1" w:color="D9DEE4"/>
+        </w:pBdr>
       </w:pPr>
     </w:p>
     <w:p>
       <w:pPr>
-        <w:spacing w:before="240" w:after="80"/>
+        <w:spacing w:after="100" w:line="288" w:lineRule="auto"/>
+        <w:jc w:val="left"/>
       </w:pPr>
       <w:r>
         <w:rPr>
-          <w:rFonts w:ascii="Arial" w:hAnsi="Arial"/>
           <w:b/>
+          <w:i w:val="0"/>
           <w:color w:val="1F4E78"/>
-          <w:sz w:val="26"/>
+          <w:sz w:val="32"/>
         </w:rPr>
-        <w:t>■  Funded Research Projects</w:t>
-      </w:r>
-    </w:p>
-    <w:tbl>
-      <w:tblPr>
-        <w:tblW w:type="auto" w:w="0"/>
-        <w:jc w:val="center"/>
-        <w:tblLook w:firstColumn="1" w:firstRow="1" w:lastColumn="0" w:lastRow="0" w:noHBand="0" w:noVBand="1" w:val="04A0"/>
-      </w:tblPr>
-      <w:tblGrid>
-        <w:gridCol w:w="2484"/>
-        <w:gridCol w:w="2484"/>
-        <w:gridCol w:w="2484"/>
-        <w:gridCol w:w="2484"/>
-      </w:tblGrid>
-      <w:tr>
-        <w:tc>
-          <w:tcPr>
-            <w:tcW w:type="dxa" w:w="1296"/>
-            <w:shd w:fill="1F4E78"/>
-          </w:tcPr>
-          <w:p>
-            <w:r>
-              <w:rPr>
-                <w:rFonts w:ascii="Arial" w:hAnsi="Arial"/>
-                <w:b/>
-                <w:color w:val="FFFFFF"/>
-                <w:sz w:val="19"/>
-              </w:rPr>
-              <w:t>Date</w:t>
-            </w:r>
-          </w:p>
-        </w:tc>
-        <w:tc>
-          <w:tcPr>
-            <w:tcW w:type="dxa" w:w="3168"/>
-            <w:shd w:fill="1F4E78"/>
-          </w:tcPr>
-          <w:p>
-            <w:r>
-              <w:rPr>
-                <w:rFonts w:ascii="Arial" w:hAnsi="Arial"/>
-                <w:b/>
-                <w:color w:val="FFFFFF"/>
-                <w:sz w:val="19"/>
-              </w:rPr>
-              <w:t>Title &amp; Contributor</w:t>
-            </w:r>
-          </w:p>
-        </w:tc>
-        <w:tc>
-          <w:tcPr>
-            <w:tcW w:type="dxa" w:w="2592"/>
-            <w:shd w:fill="1F4E78"/>
-          </w:tcPr>
-          <w:p>
-            <w:r>
-              <w:rPr>
-                <w:rFonts w:ascii="Arial" w:hAnsi="Arial"/>
-                <w:b/>
-                <w:color w:val="FFFFFF"/>
-                <w:sz w:val="19"/>
-              </w:rPr>
-              <w:t>Venue / Organization / Grant</w:t>
-            </w:r>
-          </w:p>
-        </w:tc>
-        <w:tc>
-          <w:tcPr>
-            <w:tcW w:type="dxa" w:w="3024"/>
-            <w:shd w:fill="1F4E78"/>
-          </w:tcPr>
-          <w:p>
-            <w:r>
-              <w:rPr>
-                <w:rFonts w:ascii="Arial" w:hAnsi="Arial"/>
-                <w:b/>
-                <w:color w:val="FFFFFF"/>
-                <w:sz w:val="19"/>
-              </w:rPr>
-              <w:t>Details &amp; Impact</w:t>
-            </w:r>
-          </w:p>
-        </w:tc>
-      </w:tr>
-      <w:tr>
-        <w:tc>
-          <w:tcPr>
-            <w:tcW w:type="dxa" w:w="2484"/>
-            <w:shd w:fill="FFFFFF"/>
-          </w:tcPr>
-          <w:p>
-            <w:r>
-              <w:rPr>
-                <w:sz w:val="18"/>
-              </w:rPr>
-              <w:t>October 2026</w:t>
-            </w:r>
-          </w:p>
-        </w:tc>
-        <w:tc>
-          <w:tcPr>
-            <w:tcW w:type="dxa" w:w="2484"/>
-            <w:shd w:fill="FFFFFF"/>
-          </w:tcPr>
-          <w:p>
-            <w:r>
-              <w:rPr>
-                <w:b/>
-                <w:sz w:val="19"/>
-              </w:rPr>
-              <w:t>AI-Powered Smart Grid Monitoring &amp; Anomaly Detection System</w:t>
-            </w:r>
-          </w:p>
-          <w:p>
-            <w:r>
-              <w:rPr>
-                <w:sz w:val="17"/>
-              </w:rPr>
-              <w:t>By: Dr. S. Kulkarni (PI), Prof. R. Varma (Co-PI)</w:t>
-            </w:r>
-          </w:p>
-        </w:tc>
-        <w:tc>
-          <w:tcPr>
-            <w:tcW w:type="dxa" w:w="2484"/>
-            <w:shd w:fill="FFFFFF"/>
-          </w:tcPr>
-          <w:p>
-            <w:r>
-              <w:rPr>
-                <w:sz w:val="18"/>
-              </w:rPr>
-              <w:t>Department of Science &amp; Technology (DST)</w:t>
-            </w:r>
-          </w:p>
-          <w:p>
-            <w:r>
-              <w:rPr>
-                <w:sz w:val="17"/>
-              </w:rPr>
-              <w:t>Value: Grant Amount: $75,000</w:t>
-            </w:r>
-          </w:p>
-          <w:p>
-            <w:r>
-              <w:rPr>
-                <w:sz w:val="17"/>
-              </w:rPr>
-              <w:t>Impact: DST National Research Grant</w:t>
-            </w:r>
-          </w:p>
-        </w:tc>
-        <w:tc>
-          <w:tcPr>
-            <w:tcW w:type="dxa" w:w="2484"/>
-            <w:shd w:fill="FFFFFF"/>
-          </w:tcPr>
-          <w:p>
-            <w:r>
-              <w:rPr>
-                <w:sz w:val="18"/>
-              </w:rPr>
-              <w:t>Sanctioned 3-year research project focused on deploying IoT sensors and edge computing models to detect electrical network grid faults in real time.</w:t>
-            </w:r>
-          </w:p>
-          <w:p>
-            <w:r>
-              <w:rPr>
-                <w:sz w:val="17"/>
-              </w:rPr>
-              <w:t>Link: https://drive.google.com/grant_letter.pdf</w:t>
-            </w:r>
-          </w:p>
-        </w:tc>
-      </w:tr>
-    </w:tbl>
-    <w:p>
-      <w:pPr>
-        <w:spacing w:after="240"/>
-      </w:pPr>
-    </w:p>
-    <w:p>
-      <w:r>
-        <w:br w:type="page"/>
+        <w:t>Keynote Speaker on Cybersecurity &amp; Zero Trust Frameworks</w:t>
       </w:r>
     </w:p>
     <w:p>
       <w:pPr>
-        <w:spacing w:before="400" w:after="160"/>
+        <w:spacing w:after="100"/>
       </w:pPr>
       <w:r>
         <w:rPr>
-          <w:rFonts w:ascii="Arial" w:hAnsi="Arial"/>
+          <w:b/>
+          <w:i w:val="0"/>
+          <w:color w:val="0F2B48"/>
+          <w:sz w:val="25"/>
+        </w:rPr>
+        <w:t>By Ms. P. Nair</w:t>
+      </w:r>
+    </w:p>
+    <w:p>
+      <w:pPr>
+        <w:spacing w:after="120"/>
+      </w:pPr>
+      <w:r>
+        <w:rPr>
+          <w:b w:val="0"/>
+          <w:i w:val="0"/>
+          <w:color w:val="64748B"/>
+          <w:sz w:val="20"/>
+        </w:rPr>
+        <w:t>International Cyber Defense Summit 2026 · October 2026</w:t>
+      </w:r>
+    </w:p>
+    <w:p>
+      <w:pPr>
+        <w:spacing w:after="160" w:line="384" w:lineRule="auto"/>
+        <w:jc w:val="left"/>
+      </w:pPr>
+      <w:r>
+        <w:rPr>
+          <w:b w:val="0"/>
+          <w:i w:val="0"/>
+          <w:color w:val="222222"/>
+          <w:sz w:val="22"/>
+        </w:rPr>
+        <w:t>Delivered an invited expert keynote session on enterprise Zero Trust Architecture to over 500 cybersecurity professionals.</w:t>
+      </w:r>
+    </w:p>
+    <w:p>
+      <w:pPr>
+        <w:pageBreakBefore/>
+        <w:tabs>
+          <w:tab w:pos="9029" w:val="right"/>
+        </w:tabs>
+        <w:spacing w:after="320"/>
+        <w:pBdr>
+          <w:top w:val="single" w:sz="36" w:space="6" w:color="1F4E78"/>
+          <w:bottom w:val="single" w:sz="12" w:space="4" w:color="1F4E78"/>
+        </w:pBdr>
+      </w:pPr>
+      <w:r>
+        <w:rPr>
           <w:b/>
           <w:color w:val="1F4E78"/>
-          <w:sz w:val="36"/>
+          <w:sz w:val="17"/>
+          <w:spacing w:val="30"/>
         </w:rPr>
-        <w:t>FACULTY ACHIEVEMENTS</w:t>
+        <w:t>IT CHRONICLES · STUDENT ACHIEVEMENTS</w:t>
+      </w:r>
+      <w:r>
+        <w:rPr>
+          <w:b/>
+          <w:color w:val="64748B"/>
+          <w:sz w:val="17"/>
+        </w:rPr>
+        <w:tab/>
+        <w:t>VOL. 1 · ISSUE 1</w:t>
       </w:r>
     </w:p>
-    <w:tbl>
-      <w:tblPr>
-        <w:tblW w:type="auto" w:w="0"/>
-        <w:jc w:val="center"/>
-        <w:tblLook w:firstColumn="1" w:firstRow="1" w:lastColumn="0" w:lastRow="0" w:noHBand="0" w:noVBand="1" w:val="04A0"/>
-      </w:tblPr>
-      <w:tblGrid>
-        <w:gridCol w:w="3312"/>
-        <w:gridCol w:w="3312"/>
-        <w:gridCol w:w="3312"/>
-      </w:tblGrid>
-      <w:tr>
-        <w:tc>
-          <w:tcPr>
-            <w:tcW w:type="dxa" w:w="3312"/>
-            <w:shd w:fill="F2F4F7"/>
-          </w:tcPr>
-          <w:p>
-            <w:r>
-              <w:rPr>
-                <w:sz w:val="18"/>
-              </w:rPr>
-              <w:t>Total Submissions</w:t>
-            </w:r>
-          </w:p>
-          <w:p>
-            <w:r>
-              <w:rPr>
-                <w:b/>
-                <w:color w:val="1F4E78"/>
-                <w:sz w:val="36"/>
-              </w:rPr>
-              <w:t>3</w:t>
-            </w:r>
-          </w:p>
-        </w:tc>
-        <w:tc>
-          <w:tcPr>
-            <w:tcW w:type="dxa" w:w="3312"/>
-            <w:shd w:fill="EBF3F9"/>
-          </w:tcPr>
-          <w:p>
-            <w:r>
-              <w:rPr>
-                <w:sz w:val="18"/>
-              </w:rPr>
-              <w:t>Active Categories</w:t>
-            </w:r>
-          </w:p>
-          <w:p>
-            <w:r>
-              <w:rPr>
-                <w:b/>
-                <w:color w:val="2E75B6"/>
-                <w:sz w:val="36"/>
-              </w:rPr>
-              <w:t>0</w:t>
-            </w:r>
-          </w:p>
-        </w:tc>
-        <w:tc>
-          <w:tcPr>
-            <w:tcW w:type="dxa" w:w="3312"/>
-            <w:shd w:fill="F2F4F7"/>
-          </w:tcPr>
-          <w:p>
-            <w:r>
-              <w:rPr>
-                <w:sz w:val="18"/>
-              </w:rPr>
-              <w:t>Section Status</w:t>
-            </w:r>
-          </w:p>
-          <w:p>
-            <w:r>
-              <w:rPr>
-                <w:b/>
-                <w:color w:val="548235"/>
-                <w:sz w:val="28"/>
-              </w:rPr>
-              <w:t>VERIFIED</w:t>
-            </w:r>
-          </w:p>
-        </w:tc>
-      </w:tr>
-    </w:tbl>
     <w:p>
       <w:pPr>
-        <w:spacing w:after="200"/>
+        <w:spacing w:after="120"/>
+      </w:pPr>
+      <w:r>
+        <w:rPr>
+          <w:b/>
+          <w:i w:val="0"/>
+          <w:color w:val="FFFFFF"/>
+          <w:sz w:val="16"/>
+          <w:shd w:val="clear" w:color="auto" w:fill="C65911"/>
+        </w:rPr>
+        <w:t xml:space="preserve">  1ST PRIZE (CASH AWARD $5,000 / ₹4,10,000)  </w:t>
+      </w:r>
+    </w:p>
+    <w:p>
+      <w:pPr>
+        <w:spacing w:after="100" w:line="288" w:lineRule="auto"/>
+        <w:jc w:val="left"/>
+      </w:pPr>
+      <w:r>
+        <w:rPr>
+          <w:b/>
+          <w:i w:val="0"/>
+          <w:color w:val="1F4E78"/>
+          <w:sz w:val="32"/>
+        </w:rPr>
+        <w:t>Global Smart Cities Hackathon Championship 2026</w:t>
+      </w:r>
+    </w:p>
+    <w:p>
+      <w:pPr>
+        <w:spacing w:after="100"/>
+      </w:pPr>
+      <w:r>
+        <w:rPr>
+          <w:b/>
+          <w:i w:val="0"/>
+          <w:color w:val="0F2B48"/>
+          <w:sz w:val="24"/>
+        </w:rPr>
+        <w:t>By Rohan Sharma, Anita Roy, Kevin Patel (Dept of IT)</w:t>
+      </w:r>
+    </w:p>
+    <w:p>
+      <w:pPr>
+        <w:spacing w:after="120"/>
+      </w:pPr>
+      <w:r>
+        <w:rPr>
+          <w:b w:val="0"/>
+          <w:i w:val="0"/>
+          <w:color w:val="64748B"/>
+          <w:sz w:val="20"/>
+        </w:rPr>
+        <w:t>TechGiant Inc. &amp; IEEE Computer Society · October 2026</w:t>
+      </w:r>
+    </w:p>
+    <w:p>
+      <w:pPr>
+        <w:spacing w:after="0"/>
+      </w:pPr>
+      <w:r>
+        <w:drawing>
+          <wp:inline xmlns:a="http://schemas.openxmlformats.org/drawingml/2006/main" xmlns:pic="http://schemas.openxmlformats.org/drawingml/2006/picture">
+            <wp:extent cx="5733288" cy="4302655"/>
+            <wp:docPr id="2" name="Picture 2"/>
+            <wp:cNvGraphicFramePr>
+              <a:graphicFrameLocks noChangeAspect="1"/>
+            </wp:cNvGraphicFramePr>
+            <a:graphic>
+              <a:graphicData uri="http://schemas.openxmlformats.org/drawingml/2006/picture">
+                <pic:pic>
+                  <pic:nvPicPr>
+                    <pic:cNvPr id="0" name="crop_86fd921a3a317404983045e684c8a201.jpg"/>
+                    <pic:cNvPicPr/>
+                  </pic:nvPicPr>
+                  <pic:blipFill>
+                    <a:blip r:embed="rId15"/>
+                    <a:stretch>
+                      <a:fillRect/>
+                    </a:stretch>
+                  </pic:blipFill>
+                  <pic:spPr>
+                    <a:xfrm>
+                      <a:off x="0" y="0"/>
+                      <a:ext cx="5733288" cy="4302655"/>
+                    </a:xfrm>
+                    <a:prstGeom prst="rect"/>
+                  </pic:spPr>
+                </pic:pic>
+              </a:graphicData>
+            </a:graphic>
+          </wp:inline>
+        </w:drawing>
+      </w:r>
+    </w:p>
+    <w:p>
+      <w:pPr>
+        <w:spacing w:after="160"/>
+        <w:shd w:val="clear" w:color="auto" w:fill="F8FAFC"/>
+      </w:pPr>
+      <w:r>
+        <w:rPr>
+          <w:b w:val="0"/>
+          <w:i/>
+          <w:color w:val="64748B"/>
+          <w:sz w:val="18"/>
+        </w:rPr>
+        <w:t xml:space="preserve"> Left to Right: Rohan Sharma, Anita Roy, Kevin Patel holding the 1st Place Hackathon Trophy</w:t>
+      </w:r>
+    </w:p>
+    <w:p>
+      <w:pPr>
+        <w:spacing w:after="160" w:line="384" w:lineRule="auto"/>
+        <w:jc w:val="left"/>
+      </w:pPr>
+      <w:r>
+        <w:rPr>
+          <w:b w:val="0"/>
+          <w:i w:val="0"/>
+          <w:color w:val="334155"/>
+          <w:sz w:val="22"/>
+        </w:rPr>
+        <w:t>Secured 1st rank among 350+ international university teams by developing an autonomous AI disaster dispatch drone management system capable of optimizing medical kit deliveries during flood relief operations.</w:t>
+      </w:r>
+    </w:p>
+    <w:p>
+      <w:pPr>
+        <w:spacing w:after="160"/>
+      </w:pPr>
+      <w:hyperlink r:id="rId16">
+        <w:r>
+          <w:rPr>
+            <w:b/>
+            <w:color w:val="FFFFFF"/>
+            <w:sz w:val="19"/>
+            <w:shd w:val="clear" w:color="auto" w:fill="1F4E78"/>
+          </w:rPr>
+          <w:t xml:space="preserve">   🏆 View Certificate &amp; Project Demo   </w:t>
+        </w:r>
+      </w:hyperlink>
+    </w:p>
+    <w:p>
+      <w:pPr>
+        <w:spacing w:before="200" w:after="200"/>
+        <w:pBdr>
+          <w:bottom w:val="single" w:sz="6" w:space="1" w:color="D9DEE4"/>
+        </w:pBdr>
       </w:pPr>
     </w:p>
     <w:p>
       <w:pPr>
-        <w:spacing w:before="240"/>
+        <w:spacing w:after="120"/>
       </w:pPr>
       <w:r>
         <w:rPr>
-          <w:rFonts w:ascii="Arial" w:hAnsi="Arial"/>
           <w:b/>
-          <w:color w:val="C65911"/>
-          <w:sz w:val="26"/>
+          <w:i w:val="0"/>
+          <w:color w:val="FFFFFF"/>
+          <w:sz w:val="16"/>
+          <w:shd w:val="clear" w:color="auto" w:fill="C65911"/>
         </w:rPr>
-        <w:t>★  SPOTLIGHT &amp; FEATURED HIGHLIGHTS</w:t>
+        <w:t xml:space="preserve">  1ST PRIZE ($5,000)  </w:t>
       </w:r>
     </w:p>
-    <w:tbl>
-      <w:tblPr>
-        <w:tblW w:type="auto" w:w="0"/>
-        <w:jc w:val="center"/>
-        <w:tblLook w:firstColumn="1" w:firstRow="1" w:lastColumn="0" w:lastRow="0" w:noHBand="0" w:noVBand="1" w:val="04A0"/>
-      </w:tblPr>
-      <w:tblGrid>
-        <w:gridCol w:w="9936"/>
-      </w:tblGrid>
-      <w:tr>
-        <w:tc>
-          <w:tcPr>
-            <w:tcW w:type="dxa" w:w="9936"/>
-            <w:shd w:fill="FFF8F0"/>
-          </w:tcPr>
-          <w:p>
-            <w:r>
-              <w:rPr>
-                <w:rFonts w:ascii="Arial" w:hAnsi="Arial"/>
-                <w:b/>
-                <w:color w:val="C65911"/>
-                <w:sz w:val="24"/>
-              </w:rPr>
-              <w:t>Outstanding Educator &amp; Researcher Award 2026</w:t>
-            </w:r>
-          </w:p>
-          <w:p>
-            <w:r>
-              <w:rPr>
-                <w:sz w:val="19"/>
-              </w:rPr>
-              <w:t>By: Prof. Rajesh Varma  |  Date: September 2026</w:t>
-            </w:r>
-            <w:r>
-              <w:rPr>
-                <w:sz w:val="19"/>
-              </w:rPr>
-              <w:t xml:space="preserve">  |  Venue: Indian Society for Technical Education (ISTE)</w:t>
-            </w:r>
-          </w:p>
-          <w:p>
-            <w:r>
-              <w:rPr>
-                <w:sz w:val="20"/>
-              </w:rPr>
-              <w:t>Conferred the prestigious National Educator Award for excellence in computer science pedagogy and undergraduate research mentorship.</w:t>
-            </w:r>
-          </w:p>
-          <w:p>
-            <w:r>
-              <w:rPr>
-                <w:i/>
-                <w:color w:val="1F4E78"/>
-                <w:sz w:val="18"/>
-              </w:rPr>
-              <w:t>Photo Attachment: https://drive.google.com/prof_varma_award.jpg</w:t>
-            </w:r>
-          </w:p>
-        </w:tc>
-      </w:tr>
-    </w:tbl>
+    <w:p>
+      <w:pPr>
+        <w:spacing w:after="100" w:line="288" w:lineRule="auto"/>
+        <w:jc w:val="left"/>
+      </w:pPr>
+      <w:r>
+        <w:rPr>
+          <w:b/>
+          <w:i w:val="0"/>
+          <w:color w:val="1F4E78"/>
+          <w:sz w:val="32"/>
+        </w:rPr>
+        <w:t>Global Smart Cities Hackathon Championship 2026</w:t>
+      </w:r>
+    </w:p>
+    <w:p>
+      <w:pPr>
+        <w:spacing w:after="100"/>
+      </w:pPr>
+      <w:r>
+        <w:rPr>
+          <w:b/>
+          <w:i w:val="0"/>
+          <w:color w:val="0F2B48"/>
+          <w:sz w:val="24"/>
+        </w:rPr>
+        <w:t>By Rohan Sharma, Anita Roy, Kevin Patel</w:t>
+      </w:r>
+    </w:p>
+    <w:p>
+      <w:pPr>
+        <w:spacing w:after="120"/>
+      </w:pPr>
+      <w:r>
+        <w:rPr>
+          <w:b w:val="0"/>
+          <w:i w:val="0"/>
+          <w:color w:val="64748B"/>
+          <w:sz w:val="20"/>
+        </w:rPr>
+        <w:t>TechGiant Inc. &amp; IEEE · October 2026</w:t>
+      </w:r>
+    </w:p>
+    <w:p>
+      <w:pPr>
+        <w:spacing w:after="0"/>
+      </w:pPr>
+      <w:r>
+        <w:drawing>
+          <wp:inline xmlns:a="http://schemas.openxmlformats.org/drawingml/2006/main" xmlns:pic="http://schemas.openxmlformats.org/drawingml/2006/picture">
+            <wp:extent cx="5733288" cy="4302655"/>
+            <wp:docPr id="3" name="Picture 3"/>
+            <wp:cNvGraphicFramePr>
+              <a:graphicFrameLocks noChangeAspect="1"/>
+            </wp:cNvGraphicFramePr>
+            <a:graphic>
+              <a:graphicData uri="http://schemas.openxmlformats.org/drawingml/2006/picture">
+                <pic:pic>
+                  <pic:nvPicPr>
+                    <pic:cNvPr id="0" name="crop_86fd921a3a317404983045e684c8a201.jpg"/>
+                    <pic:cNvPicPr/>
+                  </pic:nvPicPr>
+                  <pic:blipFill>
+                    <a:blip r:embed="rId15"/>
+                    <a:stretch>
+                      <a:fillRect/>
+                    </a:stretch>
+                  </pic:blipFill>
+                  <pic:spPr>
+                    <a:xfrm>
+                      <a:off x="0" y="0"/>
+                      <a:ext cx="5733288" cy="4302655"/>
+                    </a:xfrm>
+                    <a:prstGeom prst="rect"/>
+                  </pic:spPr>
+                </pic:pic>
+              </a:graphicData>
+            </a:graphic>
+          </wp:inline>
+        </w:drawing>
+      </w:r>
+    </w:p>
+    <w:p>
+      <w:pPr>
+        <w:spacing w:after="160"/>
+        <w:shd w:val="clear" w:color="auto" w:fill="F8FAFC"/>
+      </w:pPr>
+      <w:r>
+        <w:rPr>
+          <w:b w:val="0"/>
+          <w:i/>
+          <w:color w:val="64748B"/>
+          <w:sz w:val="18"/>
+        </w:rPr>
+        <w:t xml:space="preserve"> Left to Right: Rohan Sharma, Anita Roy, Kevin Patel with 1st Prize trophy</w:t>
+      </w:r>
+    </w:p>
+    <w:p>
+      <w:pPr>
+        <w:spacing w:after="160" w:line="384" w:lineRule="auto"/>
+        <w:jc w:val="left"/>
+      </w:pPr>
+      <w:r>
+        <w:rPr>
+          <w:b w:val="0"/>
+          <w:i w:val="0"/>
+          <w:color w:val="334155"/>
+          <w:sz w:val="22"/>
+        </w:rPr>
+        <w:t>Built an autonomous drone dispatch platform for disaster relief operations.</w:t>
+      </w:r>
+    </w:p>
     <w:p>
       <w:pPr>
         <w:spacing w:after="160"/>
       </w:pPr>
+      <w:hyperlink r:id="rId17">
+        <w:r>
+          <w:rPr>
+            <w:b/>
+            <w:color w:val="FFFFFF"/>
+            <w:sz w:val="19"/>
+            <w:shd w:val="clear" w:color="auto" w:fill="1F4E78"/>
+          </w:rPr>
+          <w:t xml:space="preserve">   🏆 View Certificate &amp; Project Demo   </w:t>
+        </w:r>
+      </w:hyperlink>
     </w:p>
     <w:p>
       <w:pPr>
-        <w:spacing w:before="240" w:after="80"/>
-      </w:pPr>
-      <w:r>
-        <w:rPr>
-          <w:rFonts w:ascii="Arial" w:hAnsi="Arial"/>
-          <w:b/>
-          <w:color w:val="1F4E78"/>
-          <w:sz w:val="26"/>
-        </w:rPr>
-        <w:t>■  Awards &amp; Honors Received</w:t>
-      </w:r>
-    </w:p>
-    <w:tbl>
-      <w:tblPr>
-        <w:tblW w:type="auto" w:w="0"/>
-        <w:jc w:val="center"/>
-        <w:tblLook w:firstColumn="1" w:firstRow="1" w:lastColumn="0" w:lastRow="0" w:noHBand="0" w:noVBand="1" w:val="04A0"/>
-      </w:tblPr>
-      <w:tblGrid>
-        <w:gridCol w:w="2484"/>
-        <w:gridCol w:w="2484"/>
-        <w:gridCol w:w="2484"/>
-        <w:gridCol w:w="2484"/>
-      </w:tblGrid>
-      <w:tr>
-        <w:tc>
-          <w:tcPr>
-            <w:tcW w:type="dxa" w:w="1296"/>
-            <w:shd w:fill="1F4E78"/>
-          </w:tcPr>
-          <w:p>
-            <w:r>
-              <w:rPr>
-                <w:rFonts w:ascii="Arial" w:hAnsi="Arial"/>
-                <w:b/>
-                <w:color w:val="FFFFFF"/>
-                <w:sz w:val="19"/>
-              </w:rPr>
-              <w:t>Date</w:t>
-            </w:r>
-          </w:p>
-        </w:tc>
-        <w:tc>
-          <w:tcPr>
-            <w:tcW w:type="dxa" w:w="3168"/>
-            <w:shd w:fill="1F4E78"/>
-          </w:tcPr>
-          <w:p>
-            <w:r>
-              <w:rPr>
-                <w:rFonts w:ascii="Arial" w:hAnsi="Arial"/>
-                <w:b/>
-                <w:color w:val="FFFFFF"/>
-                <w:sz w:val="19"/>
-              </w:rPr>
-              <w:t>Title &amp; Contributor</w:t>
-            </w:r>
-          </w:p>
-        </w:tc>
-        <w:tc>
-          <w:tcPr>
-            <w:tcW w:type="dxa" w:w="2592"/>
-            <w:shd w:fill="1F4E78"/>
-          </w:tcPr>
-          <w:p>
-            <w:r>
-              <w:rPr>
-                <w:rFonts w:ascii="Arial" w:hAnsi="Arial"/>
-                <w:b/>
-                <w:color w:val="FFFFFF"/>
-                <w:sz w:val="19"/>
-              </w:rPr>
-              <w:t>Venue / Organization / Grant</w:t>
-            </w:r>
-          </w:p>
-        </w:tc>
-        <w:tc>
-          <w:tcPr>
-            <w:tcW w:type="dxa" w:w="3024"/>
-            <w:shd w:fill="1F4E78"/>
-          </w:tcPr>
-          <w:p>
-            <w:r>
-              <w:rPr>
-                <w:rFonts w:ascii="Arial" w:hAnsi="Arial"/>
-                <w:b/>
-                <w:color w:val="FFFFFF"/>
-                <w:sz w:val="19"/>
-              </w:rPr>
-              <w:t>Details &amp; Impact</w:t>
-            </w:r>
-          </w:p>
-        </w:tc>
-      </w:tr>
-      <w:tr>
-        <w:tc>
-          <w:tcPr>
-            <w:tcW w:type="dxa" w:w="2484"/>
-            <w:shd w:fill="FFFFFF"/>
-          </w:tcPr>
-          <w:p>
-            <w:r>
-              <w:rPr>
-                <w:sz w:val="18"/>
-              </w:rPr>
-              <w:t>September 2026</w:t>
-            </w:r>
-          </w:p>
-        </w:tc>
-        <w:tc>
-          <w:tcPr>
-            <w:tcW w:type="dxa" w:w="2484"/>
-            <w:shd w:fill="FFFFFF"/>
-          </w:tcPr>
-          <w:p>
-            <w:r>
-              <w:rPr>
-                <w:b/>
-                <w:sz w:val="19"/>
-              </w:rPr>
-              <w:t>Outstanding Educator &amp; Researcher Award 2026</w:t>
-            </w:r>
-          </w:p>
-          <w:p>
-            <w:r>
-              <w:rPr>
-                <w:sz w:val="17"/>
-              </w:rPr>
-              <w:t>By: Prof. Rajesh Varma</w:t>
-            </w:r>
-          </w:p>
-        </w:tc>
-        <w:tc>
-          <w:tcPr>
-            <w:tcW w:type="dxa" w:w="2484"/>
-            <w:shd w:fill="FFFFFF"/>
-          </w:tcPr>
-          <w:p>
-            <w:r>
-              <w:rPr>
-                <w:sz w:val="18"/>
-              </w:rPr>
-              <w:t>Indian Society for Technical Education (ISTE)</w:t>
-            </w:r>
-          </w:p>
-          <w:p>
-            <w:r>
-              <w:rPr>
-                <w:sz w:val="17"/>
-              </w:rPr>
-              <w:t>Impact: National Level</w:t>
-            </w:r>
-          </w:p>
-        </w:tc>
-        <w:tc>
-          <w:tcPr>
-            <w:tcW w:type="dxa" w:w="2484"/>
-            <w:shd w:fill="FFFFFF"/>
-          </w:tcPr>
-          <w:p>
-            <w:r>
-              <w:rPr>
-                <w:sz w:val="18"/>
-              </w:rPr>
-              <w:t>Conferred the prestigious National Educator Award for excellence in computer science pedagogy and undergraduate research mentorship.</w:t>
-            </w:r>
-          </w:p>
-        </w:tc>
-      </w:tr>
-      <w:tr>
-        <w:tc>
-          <w:tcPr>
-            <w:tcW w:type="dxa" w:w="2484"/>
-            <w:shd w:fill="F9FAFB"/>
-          </w:tcPr>
-          <w:p>
-            <w:r>
-              <w:rPr>
-                <w:sz w:val="18"/>
-              </w:rPr>
-              <w:t>September 2026</w:t>
-            </w:r>
-          </w:p>
-        </w:tc>
-        <w:tc>
-          <w:tcPr>
-            <w:tcW w:type="dxa" w:w="2484"/>
-            <w:shd w:fill="F9FAFB"/>
-          </w:tcPr>
-          <w:p>
-            <w:r>
-              <w:rPr>
-                <w:b/>
-                <w:sz w:val="19"/>
-              </w:rPr>
-              <w:t>Best Researcher Award 2026</w:t>
-            </w:r>
-          </w:p>
-          <w:p>
-            <w:r>
-              <w:rPr>
-                <w:sz w:val="17"/>
-              </w:rPr>
-              <w:t>By: Prof. Rajesh Varma</w:t>
-            </w:r>
-          </w:p>
-        </w:tc>
-        <w:tc>
-          <w:tcPr>
-            <w:tcW w:type="dxa" w:w="2484"/>
-            <w:shd w:fill="F9FAFB"/>
-          </w:tcPr>
-          <w:p>
-            <w:r>
-              <w:rPr>
-                <w:sz w:val="18"/>
-              </w:rPr>
-              <w:t>International Science Foundation</w:t>
-            </w:r>
-          </w:p>
-          <w:p>
-            <w:r>
-              <w:rPr>
-                <w:sz w:val="17"/>
-              </w:rPr>
-              <w:t>Impact: International</w:t>
-            </w:r>
-          </w:p>
-        </w:tc>
-        <w:tc>
-          <w:tcPr>
-            <w:tcW w:type="dxa" w:w="2484"/>
-            <w:shd w:fill="F9FAFB"/>
-          </w:tcPr>
-          <w:p>
-            <w:r>
-              <w:rPr>
-                <w:sz w:val="18"/>
-              </w:rPr>
-              <w:t>Awarded for exceptional contributions to distributed cloud computing architectures.</w:t>
-            </w:r>
-          </w:p>
-        </w:tc>
-      </w:tr>
-    </w:tbl>
-    <w:p>
-      <w:pPr>
-        <w:spacing w:after="240"/>
+        <w:spacing w:before="200" w:after="200"/>
+        <w:pBdr>
+          <w:bottom w:val="single" w:sz="6" w:space="1" w:color="D9DEE4"/>
+        </w:pBdr>
       </w:pPr>
     </w:p>
     <w:p>
       <w:pPr>
-        <w:spacing w:before="240" w:after="80"/>
+        <w:spacing w:after="120"/>
       </w:pPr>
       <w:r>
         <w:rPr>
-          <w:rFonts w:ascii="Arial" w:hAnsi="Arial"/>
           <w:b/>
-          <w:color w:val="1F4E78"/>
-          <w:sz w:val="26"/>
+          <w:i w:val="0"/>
+          <w:color w:val="FFFFFF"/>
+          <w:sz w:val="16"/>
+          <w:shd w:val="clear" w:color="auto" w:fill="C65911"/>
         </w:rPr>
-        <w:t>■  Invited Keynote / Expert Lectures Delivered</w:t>
-      </w:r>
-    </w:p>
-    <w:tbl>
-      <w:tblPr>
-        <w:tblW w:type="auto" w:w="0"/>
-        <w:jc w:val="center"/>
-        <w:tblLook w:firstColumn="1" w:firstRow="1" w:lastColumn="0" w:lastRow="0" w:noHBand="0" w:noVBand="1" w:val="04A0"/>
-      </w:tblPr>
-      <w:tblGrid>
-        <w:gridCol w:w="2484"/>
-        <w:gridCol w:w="2484"/>
-        <w:gridCol w:w="2484"/>
-        <w:gridCol w:w="2484"/>
-      </w:tblGrid>
-      <w:tr>
-        <w:tc>
-          <w:tcPr>
-            <w:tcW w:type="dxa" w:w="1296"/>
-            <w:shd w:fill="1F4E78"/>
-          </w:tcPr>
-          <w:p>
-            <w:r>
-              <w:rPr>
-                <w:rFonts w:ascii="Arial" w:hAnsi="Arial"/>
-                <w:b/>
-                <w:color w:val="FFFFFF"/>
-                <w:sz w:val="19"/>
-              </w:rPr>
-              <w:t>Date</w:t>
-            </w:r>
-          </w:p>
-        </w:tc>
-        <w:tc>
-          <w:tcPr>
-            <w:tcW w:type="dxa" w:w="3168"/>
-            <w:shd w:fill="1F4E78"/>
-          </w:tcPr>
-          <w:p>
-            <w:r>
-              <w:rPr>
-                <w:rFonts w:ascii="Arial" w:hAnsi="Arial"/>
-                <w:b/>
-                <w:color w:val="FFFFFF"/>
-                <w:sz w:val="19"/>
-              </w:rPr>
-              <w:t>Title &amp; Contributor</w:t>
-            </w:r>
-          </w:p>
-        </w:tc>
-        <w:tc>
-          <w:tcPr>
-            <w:tcW w:type="dxa" w:w="2592"/>
-            <w:shd w:fill="1F4E78"/>
-          </w:tcPr>
-          <w:p>
-            <w:r>
-              <w:rPr>
-                <w:rFonts w:ascii="Arial" w:hAnsi="Arial"/>
-                <w:b/>
-                <w:color w:val="FFFFFF"/>
-                <w:sz w:val="19"/>
-              </w:rPr>
-              <w:t>Venue / Organization / Grant</w:t>
-            </w:r>
-          </w:p>
-        </w:tc>
-        <w:tc>
-          <w:tcPr>
-            <w:tcW w:type="dxa" w:w="3024"/>
-            <w:shd w:fill="1F4E78"/>
-          </w:tcPr>
-          <w:p>
-            <w:r>
-              <w:rPr>
-                <w:rFonts w:ascii="Arial" w:hAnsi="Arial"/>
-                <w:b/>
-                <w:color w:val="FFFFFF"/>
-                <w:sz w:val="19"/>
-              </w:rPr>
-              <w:t>Details &amp; Impact</w:t>
-            </w:r>
-          </w:p>
-        </w:tc>
-      </w:tr>
-      <w:tr>
-        <w:tc>
-          <w:tcPr>
-            <w:tcW w:type="dxa" w:w="2484"/>
-            <w:shd w:fill="FFFFFF"/>
-          </w:tcPr>
-          <w:p>
-            <w:r>
-              <w:rPr>
-                <w:sz w:val="18"/>
-              </w:rPr>
-              <w:t>October 2026</w:t>
-            </w:r>
-          </w:p>
-        </w:tc>
-        <w:tc>
-          <w:tcPr>
-            <w:tcW w:type="dxa" w:w="2484"/>
-            <w:shd w:fill="FFFFFF"/>
-          </w:tcPr>
-          <w:p>
-            <w:r>
-              <w:rPr>
-                <w:b/>
-                <w:sz w:val="19"/>
-              </w:rPr>
-              <w:t>Keynote Speaker on Cybersecurity &amp; Zero Trust Frameworks</w:t>
-            </w:r>
-          </w:p>
-          <w:p>
-            <w:r>
-              <w:rPr>
-                <w:sz w:val="17"/>
-              </w:rPr>
-              <w:t>By: Ms. P. Nair</w:t>
-            </w:r>
-          </w:p>
-        </w:tc>
-        <w:tc>
-          <w:tcPr>
-            <w:tcW w:type="dxa" w:w="2484"/>
-            <w:shd w:fill="FFFFFF"/>
-          </w:tcPr>
-          <w:p>
-            <w:r>
-              <w:rPr>
-                <w:sz w:val="18"/>
-              </w:rPr>
-              <w:t>International Cyber Defense Summit 2026</w:t>
-            </w:r>
-          </w:p>
-          <w:p>
-            <w:r>
-              <w:rPr>
-                <w:sz w:val="17"/>
-              </w:rPr>
-              <w:t>Impact: International Level</w:t>
-            </w:r>
-          </w:p>
-        </w:tc>
-        <w:tc>
-          <w:tcPr>
-            <w:tcW w:type="dxa" w:w="2484"/>
-            <w:shd w:fill="FFFFFF"/>
-          </w:tcPr>
-          <w:p>
-            <w:r>
-              <w:rPr>
-                <w:sz w:val="18"/>
-              </w:rPr>
-              <w:t>Delivered an invited expert keynote session on enterprise Zero Trust Architecture to over 500 cybersecurity professionals.</w:t>
-            </w:r>
-          </w:p>
-        </w:tc>
-      </w:tr>
-    </w:tbl>
-    <w:p>
-      <w:pPr>
-        <w:spacing w:after="240"/>
-      </w:pPr>
-    </w:p>
-    <w:p>
-      <w:r>
-        <w:br w:type="page"/>
+        <w:t xml:space="preserve">  1ST PRIZE (CASH AWARD $5,000)  </w:t>
       </w:r>
     </w:p>
     <w:p>
       <w:pPr>
-        <w:spacing w:before="400" w:after="160"/>
+        <w:spacing w:after="100" w:line="288" w:lineRule="auto"/>
+        <w:jc w:val="left"/>
       </w:pPr>
       <w:r>
         <w:rPr>
-          <w:rFonts w:ascii="Arial" w:hAnsi="Arial"/>
           <w:b/>
+          <w:i w:val="0"/>
           <w:color w:val="1F4E78"/>
-          <w:sz w:val="36"/>
+          <w:sz w:val="32"/>
         </w:rPr>
-        <w:t>STUDENT ACHIEVEMENTS</w:t>
+        <w:t>Global Hackathon Championship 2026</w:t>
       </w:r>
     </w:p>
-    <w:tbl>
-      <w:tblPr>
-        <w:tblW w:type="auto" w:w="0"/>
-        <w:jc w:val="center"/>
-        <w:tblLook w:firstColumn="1" w:firstRow="1" w:lastColumn="0" w:lastRow="0" w:noHBand="0" w:noVBand="1" w:val="04A0"/>
-      </w:tblPr>
-      <w:tblGrid>
-        <w:gridCol w:w="3312"/>
-        <w:gridCol w:w="3312"/>
-        <w:gridCol w:w="3312"/>
-      </w:tblGrid>
-      <w:tr>
-        <w:tc>
-          <w:tcPr>
-            <w:tcW w:type="dxa" w:w="3312"/>
-            <w:shd w:fill="F2F4F7"/>
-          </w:tcPr>
-          <w:p>
-            <w:r>
-              <w:rPr>
-                <w:sz w:val="18"/>
-              </w:rPr>
-              <w:t>Total Submissions</w:t>
-            </w:r>
-          </w:p>
-          <w:p>
-            <w:r>
-              <w:rPr>
-                <w:b/>
-                <w:color w:val="1F4E78"/>
-                <w:sz w:val="36"/>
-              </w:rPr>
-              <w:t>2</w:t>
-            </w:r>
-          </w:p>
-        </w:tc>
-        <w:tc>
-          <w:tcPr>
-            <w:tcW w:type="dxa" w:w="3312"/>
-            <w:shd w:fill="EBF3F9"/>
-          </w:tcPr>
-          <w:p>
-            <w:r>
-              <w:rPr>
-                <w:sz w:val="18"/>
-              </w:rPr>
-              <w:t>Active Categories</w:t>
-            </w:r>
-          </w:p>
-          <w:p>
-            <w:r>
-              <w:rPr>
-                <w:b/>
-                <w:color w:val="2E75B6"/>
-                <w:sz w:val="36"/>
-              </w:rPr>
-              <w:t>0</w:t>
-            </w:r>
-          </w:p>
-        </w:tc>
-        <w:tc>
-          <w:tcPr>
-            <w:tcW w:type="dxa" w:w="3312"/>
-            <w:shd w:fill="F2F4F7"/>
-          </w:tcPr>
-          <w:p>
-            <w:r>
-              <w:rPr>
-                <w:sz w:val="18"/>
-              </w:rPr>
-              <w:t>Section Status</w:t>
-            </w:r>
-          </w:p>
-          <w:p>
-            <w:r>
-              <w:rPr>
-                <w:b/>
-                <w:color w:val="548235"/>
-                <w:sz w:val="28"/>
-              </w:rPr>
-              <w:t>VERIFIED</w:t>
-            </w:r>
-          </w:p>
-        </w:tc>
-      </w:tr>
-    </w:tbl>
     <w:p>
       <w:pPr>
-        <w:spacing w:after="200"/>
+        <w:spacing w:after="100"/>
+      </w:pPr>
+      <w:r>
+        <w:rPr>
+          <w:b/>
+          <w:i w:val="0"/>
+          <w:color w:val="0F2B48"/>
+          <w:sz w:val="24"/>
+        </w:rPr>
+        <w:t>By Rohan Sharma, Anita Roy, Kevin Patel</w:t>
+      </w:r>
+    </w:p>
+    <w:p>
+      <w:pPr>
+        <w:spacing w:after="120"/>
+      </w:pPr>
+      <w:r>
+        <w:rPr>
+          <w:b w:val="0"/>
+          <w:i w:val="0"/>
+          <w:color w:val="64748B"/>
+          <w:sz w:val="20"/>
+        </w:rPr>
+        <w:t>TechGiant Inc. &amp; IEEE Computer Society · October 2026</w:t>
+      </w:r>
+    </w:p>
+    <w:p>
+      <w:pPr>
+        <w:spacing w:after="160" w:line="384" w:lineRule="auto"/>
+        <w:jc w:val="left"/>
+      </w:pPr>
+      <w:r>
+        <w:rPr>
+          <w:b w:val="0"/>
+          <w:i w:val="0"/>
+          <w:color w:val="334155"/>
+          <w:sz w:val="22"/>
+        </w:rPr>
+        <w:t>Secured 1st rank out of 350 international teams for constructing an autonomous AI disaster response drone dispatch dashboard.</w:t>
+      </w:r>
+    </w:p>
+    <w:p>
+      <w:pPr>
+        <w:spacing w:after="160"/>
+      </w:pPr>
+      <w:hyperlink r:id="rId18">
+        <w:r>
+          <w:rPr>
+            <w:b/>
+            <w:color w:val="FFFFFF"/>
+            <w:sz w:val="19"/>
+            <w:shd w:val="clear" w:color="auto" w:fill="1F4E78"/>
+          </w:rPr>
+          <w:t xml:space="preserve">   🏆 View Certificate &amp; Project Demo   </w:t>
+        </w:r>
+      </w:hyperlink>
+    </w:p>
+    <w:p>
+      <w:pPr>
+        <w:spacing w:before="200" w:after="200"/>
+        <w:pBdr>
+          <w:bottom w:val="single" w:sz="6" w:space="1" w:color="D9DEE4"/>
+        </w:pBdr>
       </w:pPr>
     </w:p>
     <w:p>
       <w:pPr>
-        <w:spacing w:before="240"/>
+        <w:spacing w:after="120"/>
       </w:pPr>
       <w:r>
         <w:rPr>
-          <w:rFonts w:ascii="Arial" w:hAnsi="Arial"/>
           <w:b/>
-          <w:color w:val="C65911"/>
-          <w:sz w:val="26"/>
+          <w:i w:val="0"/>
+          <w:color w:val="FFFFFF"/>
+          <w:sz w:val="16"/>
+          <w:shd w:val="clear" w:color="auto" w:fill="C65911"/>
         </w:rPr>
-        <w:t>★  SPOTLIGHT &amp; FEATURED HIGHLIGHTS</w:t>
+        <w:t xml:space="preserve">  1ST PLACE (CASH PRIZE $2000)  </w:t>
       </w:r>
     </w:p>
-    <w:tbl>
-      <w:tblPr>
-        <w:tblW w:type="auto" w:w="0"/>
-        <w:jc w:val="center"/>
-        <w:tblLook w:firstColumn="1" w:firstRow="1" w:lastColumn="0" w:lastRow="0" w:noHBand="0" w:noVBand="1" w:val="04A0"/>
-      </w:tblPr>
-      <w:tblGrid>
-        <w:gridCol w:w="9936"/>
-      </w:tblGrid>
-      <w:tr>
-        <w:tc>
-          <w:tcPr>
-            <w:tcW w:type="dxa" w:w="9936"/>
-            <w:shd w:fill="FFF8F0"/>
-          </w:tcPr>
-          <w:p>
-            <w:r>
-              <w:rPr>
-                <w:rFonts w:ascii="Arial" w:hAnsi="Arial"/>
-                <w:b/>
-                <w:color w:val="C65911"/>
-                <w:sz w:val="24"/>
-              </w:rPr>
-              <w:t>Global Hackathon Championship 2026</w:t>
-            </w:r>
-          </w:p>
-          <w:p>
-            <w:r>
-              <w:rPr>
-                <w:sz w:val="19"/>
-              </w:rPr>
-              <w:t>By: Rohan Sharma, Anita Roy, Kevin Patel  |  Date: October 2026</w:t>
-            </w:r>
-            <w:r>
-              <w:rPr>
-                <w:sz w:val="19"/>
-              </w:rPr>
-              <w:t xml:space="preserve">  |  Venue: TechGiant Inc. &amp; IEEE Computer Society</w:t>
-            </w:r>
-          </w:p>
-          <w:p>
-            <w:r>
-              <w:rPr>
-                <w:sz w:val="20"/>
-              </w:rPr>
-              <w:t>Secured 1st rank out of 350 international teams for constructing an autonomous AI disaster response drone dispatch dashboard.</w:t>
-            </w:r>
-          </w:p>
-          <w:p>
-            <w:r>
-              <w:rPr>
-                <w:i/>
-                <w:color w:val="1F4E78"/>
-                <w:sz w:val="18"/>
-              </w:rPr>
-              <w:t>Photo Attachment: https://drive.google.com/hackathon_win.jpg</w:t>
-            </w:r>
-          </w:p>
-        </w:tc>
-      </w:tr>
-    </w:tbl>
+    <w:p>
+      <w:pPr>
+        <w:spacing w:after="100" w:line="288" w:lineRule="auto"/>
+        <w:jc w:val="left"/>
+      </w:pPr>
+      <w:r>
+        <w:rPr>
+          <w:b/>
+          <w:i w:val="0"/>
+          <w:color w:val="1F4E78"/>
+          <w:sz w:val="32"/>
+        </w:rPr>
+        <w:t>National AI Hackathon 2026</w:t>
+      </w:r>
+    </w:p>
+    <w:p>
+      <w:pPr>
+        <w:spacing w:after="100"/>
+      </w:pPr>
+      <w:r>
+        <w:rPr>
+          <w:b/>
+          <w:i w:val="0"/>
+          <w:color w:val="0F2B48"/>
+          <w:sz w:val="24"/>
+        </w:rPr>
+        <w:t>By Rohan Sharma, Anita Roy</w:t>
+      </w:r>
+    </w:p>
+    <w:p>
+      <w:pPr>
+        <w:spacing w:after="120"/>
+      </w:pPr>
+      <w:r>
+        <w:rPr>
+          <w:b w:val="0"/>
+          <w:i w:val="0"/>
+          <w:color w:val="64748B"/>
+          <w:sz w:val="20"/>
+        </w:rPr>
+        <w:t>TechCorp India · October 2026</w:t>
+      </w:r>
+    </w:p>
+    <w:p>
+      <w:pPr>
+        <w:spacing w:after="160" w:line="384" w:lineRule="auto"/>
+        <w:jc w:val="left"/>
+      </w:pPr>
+      <w:r>
+        <w:rPr>
+          <w:b w:val="0"/>
+          <w:i w:val="0"/>
+          <w:color w:val="334155"/>
+          <w:sz w:val="22"/>
+        </w:rPr>
+        <w:t>Built an automated newsletter builder platform using document transformation engines.</w:t>
+      </w:r>
+    </w:p>
+    <w:p>
+      <w:pPr>
+        <w:pageBreakBefore/>
+        <w:tabs>
+          <w:tab w:pos="9029" w:val="right"/>
+        </w:tabs>
+        <w:spacing w:after="320"/>
+        <w:pBdr>
+          <w:top w:val="single" w:sz="36" w:space="6" w:color="1F4E78"/>
+          <w:bottom w:val="single" w:sz="12" w:space="4" w:color="1F4E78"/>
+        </w:pBdr>
+      </w:pPr>
+      <w:r>
+        <w:rPr>
+          <w:b/>
+          <w:color w:val="1F4E78"/>
+          <w:sz w:val="17"/>
+          <w:spacing w:val="30"/>
+        </w:rPr>
+        <w:t>IT CHRONICLES · INDUSTRY, ALUMNI &amp; OUTREACH</w:t>
+      </w:r>
+      <w:r>
+        <w:rPr>
+          <w:b/>
+          <w:color w:val="64748B"/>
+          <w:sz w:val="17"/>
+        </w:rPr>
+        <w:tab/>
+        <w:t>VOL. 1 · ISSUE 1</w:t>
+      </w:r>
+    </w:p>
+    <w:p>
+      <w:pPr>
+        <w:spacing w:after="120"/>
+      </w:pPr>
+      <w:r>
+        <w:rPr>
+          <w:b/>
+          <w:i w:val="0"/>
+          <w:color w:val="FFFFFF"/>
+          <w:sz w:val="16"/>
+          <w:shd w:val="clear" w:color="auto" w:fill="1F4E78"/>
+        </w:rPr>
+        <w:t xml:space="preserve">  MOU SIGNED (COE SETUP)  </w:t>
+      </w:r>
+    </w:p>
+    <w:p>
+      <w:pPr>
+        <w:spacing w:after="100" w:line="288" w:lineRule="auto"/>
+        <w:jc w:val="left"/>
+      </w:pPr>
+      <w:r>
+        <w:rPr>
+          <w:b/>
+          <w:i w:val="0"/>
+          <w:color w:val="1F4E78"/>
+          <w:sz w:val="34"/>
+        </w:rPr>
+        <w:t>Strategic Academic MoU with CloudTech Systems India</w:t>
+      </w:r>
+    </w:p>
+    <w:p>
+      <w:pPr>
+        <w:spacing w:after="100"/>
+      </w:pPr>
+      <w:r>
+        <w:rPr>
+          <w:b/>
+          <w:i w:val="0"/>
+          <w:color w:val="475569"/>
+          <w:sz w:val="21"/>
+        </w:rPr>
+        <w:t>By Dr. S. Kulkarni</w:t>
+      </w:r>
+    </w:p>
+    <w:p>
+      <w:pPr>
+        <w:spacing w:after="0"/>
+      </w:pPr>
+      <w:r>
+        <w:drawing>
+          <wp:inline xmlns:a="http://schemas.openxmlformats.org/drawingml/2006/main" xmlns:pic="http://schemas.openxmlformats.org/drawingml/2006/picture">
+            <wp:extent cx="5733288" cy="3220197"/>
+            <wp:docPr id="4" name="Picture 4"/>
+            <wp:cNvGraphicFramePr>
+              <a:graphicFrameLocks noChangeAspect="1"/>
+            </wp:cNvGraphicFramePr>
+            <a:graphic>
+              <a:graphicData uri="http://schemas.openxmlformats.org/drawingml/2006/picture">
+                <pic:pic>
+                  <pic:nvPicPr>
+                    <pic:cNvPr id="0" name="crop_71825bd8b960a174dbee9db2922dc4f8.jpg"/>
+                    <pic:cNvPicPr/>
+                  </pic:nvPicPr>
+                  <pic:blipFill>
+                    <a:blip r:embed="rId19"/>
+                    <a:stretch>
+                      <a:fillRect/>
+                    </a:stretch>
+                  </pic:blipFill>
+                  <pic:spPr>
+                    <a:xfrm>
+                      <a:off x="0" y="0"/>
+                      <a:ext cx="5733288" cy="3220197"/>
+                    </a:xfrm>
+                    <a:prstGeom prst="rect"/>
+                  </pic:spPr>
+                </pic:pic>
+              </a:graphicData>
+            </a:graphic>
+          </wp:inline>
+        </w:drawing>
+      </w:r>
+    </w:p>
+    <w:p>
+      <w:pPr>
+        <w:spacing w:after="160"/>
+        <w:shd w:val="clear" w:color="auto" w:fill="F8FAFC"/>
+      </w:pPr>
+      <w:r>
+        <w:rPr>
+          <w:b w:val="0"/>
+          <w:i/>
+          <w:color w:val="64748B"/>
+          <w:sz w:val="18"/>
+        </w:rPr>
+        <w:t xml:space="preserve"> MoU Signing Ceremony between Dept of IT Leadership and CloudTech Directors</w:t>
+      </w:r>
+    </w:p>
+    <w:p>
+      <w:pPr>
+        <w:spacing w:after="160" w:line="384" w:lineRule="auto"/>
+        <w:jc w:val="left"/>
+      </w:pPr>
+      <w:r>
+        <w:rPr>
+          <w:b w:val="0"/>
+          <w:i w:val="0"/>
+          <w:color w:val="334155"/>
+          <w:sz w:val="21"/>
+        </w:rPr>
+        <w:t>Executed a 3-year comprehensive MoU establishing a dedicated Cloud Computing Center of Excellence in the department, including hardware sponsorship and internship tracks for students.</w:t>
+      </w:r>
+    </w:p>
     <w:p>
       <w:pPr>
         <w:spacing w:after="160"/>
       </w:pPr>
+      <w:hyperlink r:id="rId20">
+        <w:r>
+          <w:rPr>
+            <w:b/>
+            <w:color w:val="FFFFFF"/>
+            <w:sz w:val="19"/>
+            <w:shd w:val="clear" w:color="auto" w:fill="1F4E78"/>
+          </w:rPr>
+          <w:t xml:space="preserve">   View details   </w:t>
+        </w:r>
+      </w:hyperlink>
     </w:p>
     <w:p>
       <w:pPr>
-        <w:spacing w:before="240" w:after="80"/>
+        <w:spacing w:before="200" w:after="200"/>
+        <w:pBdr>
+          <w:bottom w:val="single" w:sz="6" w:space="1" w:color="D9DEE4"/>
+        </w:pBdr>
+      </w:pPr>
+    </w:p>
+    <w:p>
+      <w:pPr>
+        <w:spacing w:after="100" w:line="288" w:lineRule="auto"/>
+        <w:jc w:val="left"/>
       </w:pPr>
       <w:r>
         <w:rPr>
-          <w:rFonts w:ascii="Arial" w:hAnsi="Arial"/>
           <w:b/>
+          <w:i w:val="0"/>
           <w:color w:val="1F4E78"/>
-          <w:sz w:val="26"/>
+          <w:sz w:val="34"/>
         </w:rPr>
-        <w:t>■  Hackathons &amp; Coding Competitions</w:t>
-      </w:r>
-    </w:p>
-    <w:tbl>
-      <w:tblPr>
-        <w:tblW w:type="auto" w:w="0"/>
-        <w:jc w:val="center"/>
-        <w:tblLook w:firstColumn="1" w:firstRow="1" w:lastColumn="0" w:lastRow="0" w:noHBand="0" w:noVBand="1" w:val="04A0"/>
-      </w:tblPr>
-      <w:tblGrid>
-        <w:gridCol w:w="2484"/>
-        <w:gridCol w:w="2484"/>
-        <w:gridCol w:w="2484"/>
-        <w:gridCol w:w="2484"/>
-      </w:tblGrid>
-      <w:tr>
-        <w:tc>
-          <w:tcPr>
-            <w:tcW w:type="dxa" w:w="1296"/>
-            <w:shd w:fill="1F4E78"/>
-          </w:tcPr>
-          <w:p>
-            <w:r>
-              <w:rPr>
-                <w:rFonts w:ascii="Arial" w:hAnsi="Arial"/>
-                <w:b/>
-                <w:color w:val="FFFFFF"/>
-                <w:sz w:val="19"/>
-              </w:rPr>
-              <w:t>Date</w:t>
-            </w:r>
-          </w:p>
-        </w:tc>
-        <w:tc>
-          <w:tcPr>
-            <w:tcW w:type="dxa" w:w="3168"/>
-            <w:shd w:fill="1F4E78"/>
-          </w:tcPr>
-          <w:p>
-            <w:r>
-              <w:rPr>
-                <w:rFonts w:ascii="Arial" w:hAnsi="Arial"/>
-                <w:b/>
-                <w:color w:val="FFFFFF"/>
-                <w:sz w:val="19"/>
-              </w:rPr>
-              <w:t>Title &amp; Contributor</w:t>
-            </w:r>
-          </w:p>
-        </w:tc>
-        <w:tc>
-          <w:tcPr>
-            <w:tcW w:type="dxa" w:w="2592"/>
-            <w:shd w:fill="1F4E78"/>
-          </w:tcPr>
-          <w:p>
-            <w:r>
-              <w:rPr>
-                <w:rFonts w:ascii="Arial" w:hAnsi="Arial"/>
-                <w:b/>
-                <w:color w:val="FFFFFF"/>
-                <w:sz w:val="19"/>
-              </w:rPr>
-              <w:t>Venue / Organization / Grant</w:t>
-            </w:r>
-          </w:p>
-        </w:tc>
-        <w:tc>
-          <w:tcPr>
-            <w:tcW w:type="dxa" w:w="3024"/>
-            <w:shd w:fill="1F4E78"/>
-          </w:tcPr>
-          <w:p>
-            <w:r>
-              <w:rPr>
-                <w:rFonts w:ascii="Arial" w:hAnsi="Arial"/>
-                <w:b/>
-                <w:color w:val="FFFFFF"/>
-                <w:sz w:val="19"/>
-              </w:rPr>
-              <w:t>Details &amp; Impact</w:t>
-            </w:r>
-          </w:p>
-        </w:tc>
-      </w:tr>
-      <w:tr>
-        <w:tc>
-          <w:tcPr>
-            <w:tcW w:type="dxa" w:w="2484"/>
-            <w:shd w:fill="FFFFFF"/>
-          </w:tcPr>
-          <w:p>
-            <w:r>
-              <w:rPr>
-                <w:sz w:val="18"/>
-              </w:rPr>
-              <w:t>October 2026</w:t>
-            </w:r>
-          </w:p>
-        </w:tc>
-        <w:tc>
-          <w:tcPr>
-            <w:tcW w:type="dxa" w:w="2484"/>
-            <w:shd w:fill="FFFFFF"/>
-          </w:tcPr>
-          <w:p>
-            <w:r>
-              <w:rPr>
-                <w:b/>
-                <w:sz w:val="19"/>
-              </w:rPr>
-              <w:t>Global Hackathon Championship 2026</w:t>
-            </w:r>
-          </w:p>
-          <w:p>
-            <w:r>
-              <w:rPr>
-                <w:sz w:val="17"/>
-              </w:rPr>
-              <w:t>By: Rohan Sharma, Anita Roy, Kevin Patel</w:t>
-            </w:r>
-          </w:p>
-        </w:tc>
-        <w:tc>
-          <w:tcPr>
-            <w:tcW w:type="dxa" w:w="2484"/>
-            <w:shd w:fill="FFFFFF"/>
-          </w:tcPr>
-          <w:p>
-            <w:r>
-              <w:rPr>
-                <w:sz w:val="18"/>
-              </w:rPr>
-              <w:t>TechGiant Inc. &amp; IEEE Computer Society</w:t>
-            </w:r>
-          </w:p>
-          <w:p>
-            <w:r>
-              <w:rPr>
-                <w:sz w:val="17"/>
-              </w:rPr>
-              <w:t>Value: 1st Prize (Cash Award $5,000)</w:t>
-            </w:r>
-          </w:p>
-        </w:tc>
-        <w:tc>
-          <w:tcPr>
-            <w:tcW w:type="dxa" w:w="2484"/>
-            <w:shd w:fill="FFFFFF"/>
-          </w:tcPr>
-          <w:p>
-            <w:r>
-              <w:rPr>
-                <w:sz w:val="18"/>
-              </w:rPr>
-              <w:t>Secured 1st rank out of 350 international teams for constructing an autonomous AI disaster response drone dispatch dashboard.</w:t>
-            </w:r>
-          </w:p>
-          <w:p>
-            <w:r>
-              <w:rPr>
-                <w:sz w:val="17"/>
-              </w:rPr>
-              <w:t>Link: https://drive.google.com/cert_hackathon.pdf</w:t>
-            </w:r>
-          </w:p>
-        </w:tc>
-      </w:tr>
-      <w:tr>
-        <w:tc>
-          <w:tcPr>
-            <w:tcW w:type="dxa" w:w="2484"/>
-            <w:shd w:fill="F9FAFB"/>
-          </w:tcPr>
-          <w:p>
-            <w:r>
-              <w:rPr>
-                <w:sz w:val="18"/>
-              </w:rPr>
-              <w:t>October 2026</w:t>
-            </w:r>
-          </w:p>
-        </w:tc>
-        <w:tc>
-          <w:tcPr>
-            <w:tcW w:type="dxa" w:w="2484"/>
-            <w:shd w:fill="F9FAFB"/>
-          </w:tcPr>
-          <w:p>
-            <w:r>
-              <w:rPr>
-                <w:b/>
-                <w:sz w:val="19"/>
-              </w:rPr>
-              <w:t>National AI Hackathon 2026</w:t>
-            </w:r>
-          </w:p>
-          <w:p>
-            <w:r>
-              <w:rPr>
-                <w:sz w:val="17"/>
-              </w:rPr>
-              <w:t>By: Rohan Sharma, Anita Roy</w:t>
-            </w:r>
-          </w:p>
-        </w:tc>
-        <w:tc>
-          <w:tcPr>
-            <w:tcW w:type="dxa" w:w="2484"/>
-            <w:shd w:fill="F9FAFB"/>
-          </w:tcPr>
-          <w:p>
-            <w:r>
-              <w:rPr>
-                <w:sz w:val="18"/>
-              </w:rPr>
-              <w:t>TechCorp India</w:t>
-            </w:r>
-          </w:p>
-          <w:p>
-            <w:r>
-              <w:rPr>
-                <w:sz w:val="17"/>
-              </w:rPr>
-              <w:t>Value: 1st Place (Cash Prize $2000)</w:t>
-            </w:r>
-          </w:p>
-        </w:tc>
-        <w:tc>
-          <w:tcPr>
-            <w:tcW w:type="dxa" w:w="2484"/>
-            <w:shd w:fill="F9FAFB"/>
-          </w:tcPr>
-          <w:p>
-            <w:r>
-              <w:rPr>
-                <w:sz w:val="18"/>
-              </w:rPr>
-              <w:t>Built an automated newsletter builder platform using document transformation engines.</w:t>
-            </w:r>
-          </w:p>
-        </w:tc>
-      </w:tr>
-    </w:tbl>
-    <w:p>
-      <w:pPr>
-        <w:spacing w:after="240"/>
-      </w:pPr>
-    </w:p>
-    <w:p>
-      <w:r>
-        <w:br w:type="page"/>
+        <w:t>Strategic Academic MoU with CloudTech Systems</w:t>
       </w:r>
     </w:p>
     <w:p>
       <w:pPr>
-        <w:spacing w:before="400" w:after="160"/>
+        <w:spacing w:after="100"/>
       </w:pPr>
       <w:r>
         <w:rPr>
-          <w:rFonts w:ascii="Arial" w:hAnsi="Arial"/>
           <w:b/>
-          <w:color w:val="1F4E78"/>
-          <w:sz w:val="36"/>
+          <w:i w:val="0"/>
+          <w:color w:val="475569"/>
+          <w:sz w:val="21"/>
         </w:rPr>
-        <w:t>INDUSTRY, ALUMNI &amp; OUTREACH</w:t>
-      </w:r>
-    </w:p>
-    <w:tbl>
-      <w:tblPr>
-        <w:tblW w:type="auto" w:w="0"/>
-        <w:jc w:val="center"/>
-        <w:tblLook w:firstColumn="1" w:firstRow="1" w:lastColumn="0" w:lastRow="0" w:noHBand="0" w:noVBand="1" w:val="04A0"/>
-      </w:tblPr>
-      <w:tblGrid>
-        <w:gridCol w:w="3312"/>
-        <w:gridCol w:w="3312"/>
-        <w:gridCol w:w="3312"/>
-      </w:tblGrid>
-      <w:tr>
-        <w:tc>
-          <w:tcPr>
-            <w:tcW w:type="dxa" w:w="3312"/>
-            <w:shd w:fill="F2F4F7"/>
-          </w:tcPr>
-          <w:p>
-            <w:r>
-              <w:rPr>
-                <w:sz w:val="18"/>
-              </w:rPr>
-              <w:t>Total Submissions</w:t>
-            </w:r>
-          </w:p>
-          <w:p>
-            <w:r>
-              <w:rPr>
-                <w:b/>
-                <w:color w:val="1F4E78"/>
-                <w:sz w:val="36"/>
-              </w:rPr>
-              <w:t>1</w:t>
-            </w:r>
-          </w:p>
-        </w:tc>
-        <w:tc>
-          <w:tcPr>
-            <w:tcW w:type="dxa" w:w="3312"/>
-            <w:shd w:fill="EBF3F9"/>
-          </w:tcPr>
-          <w:p>
-            <w:r>
-              <w:rPr>
-                <w:sz w:val="18"/>
-              </w:rPr>
-              <w:t>Active Categories</w:t>
-            </w:r>
-          </w:p>
-          <w:p>
-            <w:r>
-              <w:rPr>
-                <w:b/>
-                <w:color w:val="2E75B6"/>
-                <w:sz w:val="36"/>
-              </w:rPr>
-              <w:t>0</w:t>
-            </w:r>
-          </w:p>
-        </w:tc>
-        <w:tc>
-          <w:tcPr>
-            <w:tcW w:type="dxa" w:w="3312"/>
-            <w:shd w:fill="F2F4F7"/>
-          </w:tcPr>
-          <w:p>
-            <w:r>
-              <w:rPr>
-                <w:sz w:val="18"/>
-              </w:rPr>
-              <w:t>Section Status</w:t>
-            </w:r>
-          </w:p>
-          <w:p>
-            <w:r>
-              <w:rPr>
-                <w:b/>
-                <w:color w:val="548235"/>
-                <w:sz w:val="28"/>
-              </w:rPr>
-              <w:t>VERIFIED</w:t>
-            </w:r>
-          </w:p>
-        </w:tc>
-      </w:tr>
-    </w:tbl>
-    <w:p>
-      <w:pPr>
-        <w:spacing w:after="200"/>
-      </w:pPr>
-    </w:p>
-    <w:p>
-      <w:pPr>
-        <w:spacing w:before="240" w:after="80"/>
-      </w:pPr>
-      <w:r>
-        <w:rPr>
-          <w:rFonts w:ascii="Arial" w:hAnsi="Arial"/>
-          <w:b/>
-          <w:color w:val="1F4E78"/>
-          <w:sz w:val="26"/>
-        </w:rPr>
-        <w:t>■  MoUs Signed &amp; Industrial Collaborations</w:t>
-      </w:r>
-    </w:p>
-    <w:tbl>
-      <w:tblPr>
-        <w:tblW w:type="auto" w:w="0"/>
-        <w:jc w:val="center"/>
-        <w:tblLook w:firstColumn="1" w:firstRow="1" w:lastColumn="0" w:lastRow="0" w:noHBand="0" w:noVBand="1" w:val="04A0"/>
-      </w:tblPr>
-      <w:tblGrid>
-        <w:gridCol w:w="2484"/>
-        <w:gridCol w:w="2484"/>
-        <w:gridCol w:w="2484"/>
-        <w:gridCol w:w="2484"/>
-      </w:tblGrid>
-      <w:tr>
-        <w:tc>
-          <w:tcPr>
-            <w:tcW w:type="dxa" w:w="1296"/>
-            <w:shd w:fill="1F4E78"/>
-          </w:tcPr>
-          <w:p>
-            <w:r>
-              <w:rPr>
-                <w:rFonts w:ascii="Arial" w:hAnsi="Arial"/>
-                <w:b/>
-                <w:color w:val="FFFFFF"/>
-                <w:sz w:val="19"/>
-              </w:rPr>
-              <w:t>Date</w:t>
-            </w:r>
-          </w:p>
-        </w:tc>
-        <w:tc>
-          <w:tcPr>
-            <w:tcW w:type="dxa" w:w="3168"/>
-            <w:shd w:fill="1F4E78"/>
-          </w:tcPr>
-          <w:p>
-            <w:r>
-              <w:rPr>
-                <w:rFonts w:ascii="Arial" w:hAnsi="Arial"/>
-                <w:b/>
-                <w:color w:val="FFFFFF"/>
-                <w:sz w:val="19"/>
-              </w:rPr>
-              <w:t>Title &amp; Contributor</w:t>
-            </w:r>
-          </w:p>
-        </w:tc>
-        <w:tc>
-          <w:tcPr>
-            <w:tcW w:type="dxa" w:w="2592"/>
-            <w:shd w:fill="1F4E78"/>
-          </w:tcPr>
-          <w:p>
-            <w:r>
-              <w:rPr>
-                <w:rFonts w:ascii="Arial" w:hAnsi="Arial"/>
-                <w:b/>
-                <w:color w:val="FFFFFF"/>
-                <w:sz w:val="19"/>
-              </w:rPr>
-              <w:t>Venue / Organization / Grant</w:t>
-            </w:r>
-          </w:p>
-        </w:tc>
-        <w:tc>
-          <w:tcPr>
-            <w:tcW w:type="dxa" w:w="3024"/>
-            <w:shd w:fill="1F4E78"/>
-          </w:tcPr>
-          <w:p>
-            <w:r>
-              <w:rPr>
-                <w:rFonts w:ascii="Arial" w:hAnsi="Arial"/>
-                <w:b/>
-                <w:color w:val="FFFFFF"/>
-                <w:sz w:val="19"/>
-              </w:rPr>
-              <w:t>Details &amp; Impact</w:t>
-            </w:r>
-          </w:p>
-        </w:tc>
-      </w:tr>
-      <w:tr>
-        <w:tc>
-          <w:tcPr>
-            <w:tcW w:type="dxa" w:w="2484"/>
-            <w:shd w:fill="FFFFFF"/>
-          </w:tcPr>
-          <w:p>
-            <w:r>
-              <w:rPr>
-                <w:sz w:val="18"/>
-              </w:rPr>
-              <w:t>September 2026</w:t>
-            </w:r>
-          </w:p>
-        </w:tc>
-        <w:tc>
-          <w:tcPr>
-            <w:tcW w:type="dxa" w:w="2484"/>
-            <w:shd w:fill="FFFFFF"/>
-          </w:tcPr>
-          <w:p>
-            <w:r>
-              <w:rPr>
-                <w:b/>
-                <w:sz w:val="19"/>
-              </w:rPr>
-              <w:t>Strategic Academic MoU with CloudTech Systems</w:t>
-            </w:r>
-          </w:p>
-          <w:p>
-            <w:r>
-              <w:rPr>
-                <w:sz w:val="17"/>
-              </w:rPr>
-              <w:t>By: Dr. S. Kulkarni</w:t>
-            </w:r>
-          </w:p>
-        </w:tc>
-        <w:tc>
-          <w:tcPr>
-            <w:tcW w:type="dxa" w:w="2484"/>
-            <w:shd w:fill="FFFFFF"/>
-          </w:tcPr>
-          <w:p>
-            <w:r>
-              <w:rPr>
-                <w:sz w:val="18"/>
-              </w:rPr>
-              <w:t>CloudTech Systems India Pvt Ltd</w:t>
-            </w:r>
-          </w:p>
-          <w:p>
-            <w:r>
-              <w:rPr>
-                <w:sz w:val="17"/>
-              </w:rPr>
-              <w:t>Impact: Department of IT Faculty &amp; Students</w:t>
-            </w:r>
-          </w:p>
-        </w:tc>
-        <w:tc>
-          <w:tcPr>
-            <w:tcW w:type="dxa" w:w="2484"/>
-            <w:shd w:fill="FFFFFF"/>
-          </w:tcPr>
-          <w:p>
-            <w:r>
-              <w:rPr>
-                <w:sz w:val="18"/>
-              </w:rPr>
-              <w:t>Signed an MoU establishing a specialized Cloud Computing Center of Excellence in the department with $20,000 industry hardware sponsorship.</w:t>
-            </w:r>
-          </w:p>
-        </w:tc>
-      </w:tr>
-    </w:tbl>
-    <w:p>
-      <w:pPr>
-        <w:spacing w:after="240"/>
-      </w:pPr>
-    </w:p>
-    <w:p>
-      <w:r>
-        <w:br w:type="page"/>
+        <w:t>By Dr. S. Kulkarni</w:t>
       </w:r>
     </w:p>
     <w:p>
       <w:pPr>
-        <w:spacing w:before="400" w:after="160"/>
+        <w:spacing w:after="160" w:line="384" w:lineRule="auto"/>
+        <w:jc w:val="left"/>
       </w:pPr>
       <w:r>
         <w:rPr>
-          <w:rFonts w:ascii="Arial" w:hAnsi="Arial"/>
-          <w:b/>
-          <w:color w:val="1F4E78"/>
-          <w:sz w:val="36"/>
+          <w:b w:val="0"/>
+          <w:i w:val="0"/>
+          <w:color w:val="334155"/>
+          <w:sz w:val="21"/>
         </w:rPr>
-        <w:t>DEPARTMENTAL HIGHLIGHTS</w:t>
+        <w:t>Signed an MoU establishing a specialized Cloud Computing Center of Excellence in the department with $20,000 industry hardware sponsorship.</w:t>
       </w:r>
-    </w:p>
-    <w:tbl>
-      <w:tblPr>
-        <w:tblW w:type="auto" w:w="0"/>
-        <w:jc w:val="center"/>
-        <w:tblLook w:firstColumn="1" w:firstRow="1" w:lastColumn="0" w:lastRow="0" w:noHBand="0" w:noVBand="1" w:val="04A0"/>
-      </w:tblPr>
-      <w:tblGrid>
-        <w:gridCol w:w="3312"/>
-        <w:gridCol w:w="3312"/>
-        <w:gridCol w:w="3312"/>
-      </w:tblGrid>
-      <w:tr>
-        <w:tc>
-          <w:tcPr>
-            <w:tcW w:type="dxa" w:w="3312"/>
-            <w:shd w:fill="F2F4F7"/>
-          </w:tcPr>
-          <w:p>
-            <w:r>
-              <w:rPr>
-                <w:sz w:val="18"/>
-              </w:rPr>
-              <w:t>Total Submissions</w:t>
-            </w:r>
-          </w:p>
-          <w:p>
-            <w:r>
-              <w:rPr>
-                <w:b/>
-                <w:color w:val="1F4E78"/>
-                <w:sz w:val="36"/>
-              </w:rPr>
-              <w:t>1</w:t>
-            </w:r>
-          </w:p>
-        </w:tc>
-        <w:tc>
-          <w:tcPr>
-            <w:tcW w:type="dxa" w:w="3312"/>
-            <w:shd w:fill="EBF3F9"/>
-          </w:tcPr>
-          <w:p>
-            <w:r>
-              <w:rPr>
-                <w:sz w:val="18"/>
-              </w:rPr>
-              <w:t>Active Categories</w:t>
-            </w:r>
-          </w:p>
-          <w:p>
-            <w:r>
-              <w:rPr>
-                <w:b/>
-                <w:color w:val="2E75B6"/>
-                <w:sz w:val="36"/>
-              </w:rPr>
-              <w:t>0</w:t>
-            </w:r>
-          </w:p>
-        </w:tc>
-        <w:tc>
-          <w:tcPr>
-            <w:tcW w:type="dxa" w:w="3312"/>
-            <w:shd w:fill="F2F4F7"/>
-          </w:tcPr>
-          <w:p>
-            <w:r>
-              <w:rPr>
-                <w:sz w:val="18"/>
-              </w:rPr>
-              <w:t>Section Status</w:t>
-            </w:r>
-          </w:p>
-          <w:p>
-            <w:r>
-              <w:rPr>
-                <w:b/>
-                <w:color w:val="548235"/>
-                <w:sz w:val="28"/>
-              </w:rPr>
-              <w:t>VERIFIED</w:t>
-            </w:r>
-          </w:p>
-        </w:tc>
-      </w:tr>
-    </w:tbl>
-    <w:p>
-      <w:pPr>
-        <w:spacing w:after="200"/>
-      </w:pPr>
     </w:p>
     <w:p>
       <w:pPr>
-        <w:spacing w:before="240" w:after="80"/>
+        <w:pageBreakBefore/>
+        <w:tabs>
+          <w:tab w:pos="9029" w:val="right"/>
+        </w:tabs>
+        <w:spacing w:after="320"/>
+        <w:pBdr>
+          <w:top w:val="single" w:sz="36" w:space="6" w:color="1F4E78"/>
+          <w:bottom w:val="single" w:sz="12" w:space="4" w:color="1F4E78"/>
+        </w:pBdr>
       </w:pPr>
       <w:r>
         <w:rPr>
-          <w:rFonts w:ascii="Arial" w:hAnsi="Arial"/>
           <w:b/>
           <w:color w:val="1F4E78"/>
-          <w:sz w:val="26"/>
+          <w:sz w:val="17"/>
+          <w:spacing w:val="30"/>
         </w:rPr>
-        <w:t>■  Infrastructure &amp; Lab Upgrades</w:t>
+        <w:t>IT CHRONICLES · DEPARTMENTAL HIGHLIGHTS</w:t>
+      </w:r>
+      <w:r>
+        <w:rPr>
+          <w:b/>
+          <w:color w:val="64748B"/>
+          <w:sz w:val="17"/>
+        </w:rPr>
+        <w:tab/>
+        <w:t>VOL. 1 · ISSUE 1</w:t>
       </w:r>
     </w:p>
-    <w:tbl>
-      <w:tblPr>
-        <w:tblW w:type="auto" w:w="0"/>
-        <w:jc w:val="center"/>
-        <w:tblLook w:firstColumn="1" w:firstRow="1" w:lastColumn="0" w:lastRow="0" w:noHBand="0" w:noVBand="1" w:val="04A0"/>
-      </w:tblPr>
-      <w:tblGrid>
-        <w:gridCol w:w="2484"/>
-        <w:gridCol w:w="2484"/>
-        <w:gridCol w:w="2484"/>
-        <w:gridCol w:w="2484"/>
-      </w:tblGrid>
-      <w:tr>
-        <w:tc>
-          <w:tcPr>
-            <w:tcW w:type="dxa" w:w="1296"/>
-            <w:shd w:fill="1F4E78"/>
-          </w:tcPr>
-          <w:p>
-            <w:r>
-              <w:rPr>
-                <w:rFonts w:ascii="Arial" w:hAnsi="Arial"/>
-                <w:b/>
-                <w:color w:val="FFFFFF"/>
-                <w:sz w:val="19"/>
-              </w:rPr>
-              <w:t>Date</w:t>
-            </w:r>
-          </w:p>
-        </w:tc>
-        <w:tc>
-          <w:tcPr>
-            <w:tcW w:type="dxa" w:w="3168"/>
-            <w:shd w:fill="1F4E78"/>
-          </w:tcPr>
-          <w:p>
-            <w:r>
-              <w:rPr>
-                <w:rFonts w:ascii="Arial" w:hAnsi="Arial"/>
-                <w:b/>
-                <w:color w:val="FFFFFF"/>
-                <w:sz w:val="19"/>
-              </w:rPr>
-              <w:t>Title &amp; Contributor</w:t>
-            </w:r>
-          </w:p>
-        </w:tc>
-        <w:tc>
-          <w:tcPr>
-            <w:tcW w:type="dxa" w:w="2592"/>
-            <w:shd w:fill="1F4E78"/>
-          </w:tcPr>
-          <w:p>
-            <w:r>
-              <w:rPr>
-                <w:rFonts w:ascii="Arial" w:hAnsi="Arial"/>
-                <w:b/>
-                <w:color w:val="FFFFFF"/>
-                <w:sz w:val="19"/>
-              </w:rPr>
-              <w:t>Venue / Organization / Grant</w:t>
-            </w:r>
-          </w:p>
-        </w:tc>
-        <w:tc>
-          <w:tcPr>
-            <w:tcW w:type="dxa" w:w="3024"/>
-            <w:shd w:fill="1F4E78"/>
-          </w:tcPr>
-          <w:p>
-            <w:r>
-              <w:rPr>
-                <w:rFonts w:ascii="Arial" w:hAnsi="Arial"/>
-                <w:b/>
-                <w:color w:val="FFFFFF"/>
-                <w:sz w:val="19"/>
-              </w:rPr>
-              <w:t>Details &amp; Impact</w:t>
-            </w:r>
-          </w:p>
-        </w:tc>
-      </w:tr>
-      <w:tr>
-        <w:tc>
-          <w:tcPr>
-            <w:tcW w:type="dxa" w:w="2484"/>
-            <w:shd w:fill="FFFFFF"/>
-          </w:tcPr>
-          <w:p>
-            <w:r>
-              <w:rPr>
-                <w:sz w:val="18"/>
-              </w:rPr>
-              <w:t>October 2026</w:t>
-            </w:r>
-          </w:p>
-        </w:tc>
-        <w:tc>
-          <w:tcPr>
-            <w:tcW w:type="dxa" w:w="2484"/>
-            <w:shd w:fill="FFFFFF"/>
-          </w:tcPr>
-          <w:p>
-            <w:r>
-              <w:rPr>
-                <w:b/>
-                <w:sz w:val="19"/>
-              </w:rPr>
-              <w:t>Inauguration of Advanced High-Performance AI Computing Lab</w:t>
-            </w:r>
-          </w:p>
-          <w:p>
-            <w:r>
-              <w:rPr>
-                <w:sz w:val="17"/>
-              </w:rPr>
-              <w:t>By: Dr. A. Sharma, Prof. R. Varma</w:t>
-            </w:r>
-          </w:p>
-        </w:tc>
-        <w:tc>
-          <w:tcPr>
-            <w:tcW w:type="dxa" w:w="2484"/>
-            <w:shd w:fill="FFFFFF"/>
-          </w:tcPr>
-          <w:p/>
-          <w:p>
-            <w:r>
-              <w:rPr>
-                <w:sz w:val="17"/>
-              </w:rPr>
-              <w:t>Value: Nvidia RTX Workstations (40 Units)</w:t>
-            </w:r>
-          </w:p>
-        </w:tc>
-        <w:tc>
-          <w:tcPr>
-            <w:tcW w:type="dxa" w:w="2484"/>
-            <w:shd w:fill="FFFFFF"/>
-          </w:tcPr>
-          <w:p>
-            <w:r>
-              <w:rPr>
-                <w:sz w:val="18"/>
-              </w:rPr>
-              <w:t>Upgraded departmental computing facility with 40 high-end GPU workstations dedicated to Deep Learning, Computer Vision, and Data Analytics labs.</w:t>
-            </w:r>
-          </w:p>
-        </w:tc>
-      </w:tr>
-    </w:tbl>
     <w:p>
       <w:pPr>
-        <w:spacing w:after="240"/>
+        <w:spacing w:after="100" w:line="288" w:lineRule="auto"/>
+        <w:jc w:val="left"/>
+      </w:pPr>
+      <w:r>
+        <w:rPr>
+          <w:b/>
+          <w:i w:val="0"/>
+          <w:color w:val="1F4E78"/>
+          <w:sz w:val="34"/>
+        </w:rPr>
+        <w:t>Inauguration of Advanced High-Performance AI Computing Lab</w:t>
+      </w:r>
+    </w:p>
+    <w:p>
+      <w:pPr>
+        <w:spacing w:after="100"/>
+      </w:pPr>
+      <w:r>
+        <w:rPr>
+          <w:b/>
+          <w:i w:val="0"/>
+          <w:color w:val="5A6B7C"/>
+          <w:sz w:val="22"/>
+        </w:rPr>
+        <w:t>By Dr. A. Sharma, Prof. R. Varma</w:t>
+      </w:r>
+    </w:p>
+    <w:p>
+      <w:pPr>
+        <w:spacing w:after="160" w:line="384" w:lineRule="auto"/>
+        <w:jc w:val="left"/>
+      </w:pPr>
+      <w:r>
+        <w:rPr>
+          <w:b w:val="0"/>
+          <w:i w:val="0"/>
+          <w:color w:val="222222"/>
+          <w:sz w:val="22"/>
+        </w:rPr>
+        <w:t>Upgraded departmental computing facility with 40 high-end GPU workstations dedicated to Deep Learning, Computer Vision, and Data Analytics labs.</w:t>
+      </w:r>
+    </w:p>
+    <w:p>
+      <w:pPr>
+        <w:spacing w:before="120" w:after="120"/>
+        <w:pBdr>
+          <w:bottom w:val="single" w:sz="6" w:space="1" w:color="E2E8F0"/>
+        </w:pBdr>
       </w:pPr>
     </w:p>
-    <w:p>
-      <w:r>
-        <w:br w:type="page"/>
-      </w:r>
-    </w:p>
     <w:sectPr>
-      <w:pgSz w:w="12240" w:h="15840"/>
-      <w:pgMar w:top="1152" w:right="1152" w:bottom="1152" w:left="1152" w:header="720" w:footer="720" w:gutter="0"/>
+      <w:pgSz w:w="11909" w:h="16834"/>
+      <w:pgMar w:top="1152" w:right="1440" w:bottom="1152" w:left="1440" w:header="720" w:footer="720" w:gutter="0"/>
       <w:cols w:space="720"/>
       <w:docGrid w:linePitch="360"/>
     </w:sectPr>
@@ -2796,6 +2096,13 @@
     <w:name w:val="Normal"/>
     <w:qFormat/>
     <w:rsid w:val="00FC693F"/>
+    <w:pPr>
+      <w:spacing w:before="0" w:after="0"/>
+    </w:pPr>
+    <w:rPr>
+      <w:rFonts w:ascii="Calibri" w:hAnsi="Calibri" w:eastAsia="Calibri"/>
+      <w:sz w:val="21"/>
+    </w:rPr>
   </w:style>
   <w:style w:type="paragraph" w:styleId="Header">
     <w:name w:val="header"/>

</xml_diff>